<commit_message>
Citizen brief v3.0: all ten constituent statements checked against the record, Appendix H crosswalk, reviewer pass
Co-authored-by: CaptainWrechols <CaptainWrechols@users.noreply.github.com>
</commit_message>
<xml_diff>
--- a/briefs/nevada/water-scarcity/citizen-v1/appendices/appendices.docx
+++ b/briefs/nevada/water-scarcity/citizen-v1/appendices/appendices.docx
@@ -272,6 +272,35 @@
             </w:pPr>
             <w:r>
               <w:t xml:space="preserve">Introduced vs. final text for governor-bound bills</w:t>
+            </w:r>
+          </w:p>
+        </w:tc>
+      </w:tr>
+      <w:tr>
+        <w:tc>
+          <w:tcPr/>
+          <w:p>
+            <w:pPr>
+              <w:pStyle w:val="Compact"/>
+              <w:jc w:val="left"/>
+            </w:pPr>
+            <w:r>
+              <w:rPr>
+                <w:rStyle w:val="VerbatimChar"/>
+              </w:rPr>
+              <w:t xml:space="preserve">H-citizen-statements-crosswalk.md</w:t>
+            </w:r>
+          </w:p>
+        </w:tc>
+        <w:tc>
+          <w:tcPr/>
+          <w:p>
+            <w:pPr>
+              <w:pStyle w:val="Compact"/>
+              <w:jc w:val="left"/>
+            </w:pPr>
+            <w:r>
+              <w:t xml:space="preserve">The ten most common citizen statements, each checked against the record</w:t>
             </w:r>
           </w:p>
         </w:tc>
@@ -8392,7 +8421,7 @@
               <w:jc w:val="left"/>
             </w:pPr>
             <w:r>
-              <w:t xml:space="preserve">Would have changed funding for well supervisors (retry of 2023 SB112)</w:t>
+              <w:t xml:space="preserve">Would have funded groundwater basin budgets, monitoring, digitizing water records, and staff to sort old water rights claims — died in first committee</w:t>
             </w:r>
           </w:p>
         </w:tc>
@@ -19357,7 +19386,7 @@
               <w:jc w:val="left"/>
             </w:pPr>
             <w:r>
-              <w:t xml:space="preserve">Would have changed funding for well supervisors (retry of 2023 SB112)</w:t>
+              <w:t xml:space="preserve">Would have funded groundwater basin budgets, monitoring, digitizing water records, and staff to sort old water rights claims — died in first committee</w:t>
             </w:r>
           </w:p>
         </w:tc>
@@ -58604,6 +58633,3572 @@
       </w:tr>
     </w:tbl>
     <w:bookmarkEnd w:id="44"/>
+    <w:bookmarkStart w:id="55" w:name="Xa6145071e711d01a3e4f8bb0098db67a83de095"/>
+    <w:p>
+      <w:pPr>
+        <w:pStyle w:val="Heading1"/>
+      </w:pPr>
+      <w:r>
+        <w:t xml:space="preserve">Appendix H — Citizen statements, checked against the record</w:t>
+      </w:r>
+    </w:p>
+    <w:p>
+      <w:pPr>
+        <w:pStyle w:val="FirstParagraph"/>
+      </w:pPr>
+      <w:r>
+        <w:t xml:space="preserve">The ten most common citizen statements on water from the Phase 2 Community Conversations (RAG constituent-voice dataset), each checked against the 2019–2025 bill record.</w:t>
+      </w:r>
+      <w:r>
+        <w:t xml:space="preserve"> </w:t>
+      </w:r>
+      <w:r>
+        <w:t xml:space="preserve">“</w:t>
+      </w:r>
+      <w:r>
+        <w:t xml:space="preserve">Never filed</w:t>
+      </w:r>
+      <w:r>
+        <w:t xml:space="preserve">”</w:t>
+      </w:r>
+      <w:r>
+        <w:t xml:space="preserve"> </w:t>
+      </w:r>
+      <w:r>
+        <w:t xml:space="preserve">means no bill in this record proposed it — not that it is impossible.</w:t>
+      </w:r>
+    </w:p>
+    <w:bookmarkStart w:id="45" w:name="X53227b198f81fec8b20096d824d91d8fa49f6c1"/>
+    <w:p>
+      <w:pPr>
+        <w:pStyle w:val="Heading2"/>
+      </w:pPr>
+      <w:r>
+        <w:t xml:space="preserve">1. Create a statewide water study group / plan modeled on the Economic Forum - technical experts who inventory supply and report to the legislature.</w:t>
+      </w:r>
+    </w:p>
+    <w:p>
+      <w:pPr>
+        <w:numPr>
+          <w:ilvl w:val="0"/>
+          <w:numId w:val="1012"/>
+        </w:numPr>
+        <w:pStyle w:val="Compact"/>
+      </w:pPr>
+      <w:r>
+        <w:rPr>
+          <w:bCs/>
+          <w:b/>
+        </w:rPr>
+        <w:t xml:space="preserve">Status:</w:t>
+      </w:r>
+      <w:r>
+        <w:t xml:space="preserve"> </w:t>
+      </w:r>
+      <w:r>
+        <w:t xml:space="preserve">Tried, but stalled</w:t>
+      </w:r>
+    </w:p>
+    <w:p>
+      <w:pPr>
+        <w:numPr>
+          <w:ilvl w:val="0"/>
+          <w:numId w:val="1012"/>
+        </w:numPr>
+        <w:pStyle w:val="Compact"/>
+      </w:pPr>
+      <w:r>
+        <w:rPr>
+          <w:bCs/>
+          <w:b/>
+        </w:rPr>
+        <w:t xml:space="preserve">The record:</w:t>
+      </w:r>
+      <w:r>
+        <w:t xml:space="preserve"> </w:t>
+      </w:r>
+      <w:r>
+        <w:t xml:space="preserve">Filed twice, finished zero times. 2019 SB499 (new state water planning advisory board) died in its first committee. 2025 SB143 (interim committee review of water conservation plus a turf study) passed the Senate 21-0 and died in the Assembly. No Economic Forum-style water body exists in statute.</w:t>
+      </w:r>
+    </w:p>
+    <w:p>
+      <w:pPr>
+        <w:numPr>
+          <w:ilvl w:val="0"/>
+          <w:numId w:val="1012"/>
+        </w:numPr>
+        <w:pStyle w:val="Compact"/>
+      </w:pPr>
+      <w:r>
+        <w:rPr>
+          <w:bCs/>
+          <w:b/>
+        </w:rPr>
+        <w:t xml:space="preserve">Where the decision sits:</w:t>
+      </w:r>
+      <w:r>
+        <w:t xml:space="preserve"> </w:t>
+      </w:r>
+      <w:r>
+        <w:t xml:space="preserve">Fully a state-legislature lever. The legislature’s own interim committees did study data-center water/energy in 2026 - a temporary version of what citizens describe.</w:t>
+      </w:r>
+    </w:p>
+    <w:tbl>
+      <w:tblPr>
+        <w:tblStyle w:val="Table"/>
+        <w:tblW w:type="pct" w:w="5000"/>
+        <w:tblLook w:firstRow="1" w:lastRow="0" w:firstColumn="0" w:lastColumn="0" w:noHBand="0" w:noVBand="0" w:val="0020"/>
+        <w:jc w:val="start"/>
+      </w:tblPr>
+      <w:tblGrid>
+        <w:gridCol w:w="1980"/>
+        <w:gridCol w:w="1980"/>
+        <w:gridCol w:w="1980"/>
+        <w:gridCol w:w="1980"/>
+      </w:tblGrid>
+      <w:tr>
+        <w:trPr>
+          <w:tblHeader w:val="true"/>
+        </w:trPr>
+        <w:tc>
+          <w:tcPr/>
+          <w:p>
+            <w:pPr>
+              <w:pStyle w:val="Compact"/>
+              <w:jc w:val="left"/>
+            </w:pPr>
+            <w:r>
+              <w:t xml:space="preserve">Bill</w:t>
+            </w:r>
+          </w:p>
+        </w:tc>
+        <w:tc>
+          <w:tcPr/>
+          <w:p>
+            <w:pPr>
+              <w:pStyle w:val="Compact"/>
+              <w:jc w:val="left"/>
+            </w:pPr>
+            <w:r>
+              <w:t xml:space="preserve">What it tried</w:t>
+            </w:r>
+          </w:p>
+        </w:tc>
+        <w:tc>
+          <w:tcPr/>
+          <w:p>
+            <w:pPr>
+              <w:pStyle w:val="Compact"/>
+              <w:jc w:val="left"/>
+            </w:pPr>
+            <w:r>
+              <w:t xml:space="preserve">Result</w:t>
+            </w:r>
+          </w:p>
+        </w:tc>
+        <w:tc>
+          <w:tcPr/>
+          <w:p>
+            <w:pPr>
+              <w:pStyle w:val="Compact"/>
+              <w:jc w:val="left"/>
+            </w:pPr>
+            <w:r>
+              <w:t xml:space="preserve">Where it ended</w:t>
+            </w:r>
+          </w:p>
+        </w:tc>
+      </w:tr>
+      <w:tr>
+        <w:tc>
+          <w:tcPr/>
+          <w:p>
+            <w:pPr>
+              <w:pStyle w:val="Compact"/>
+              <w:jc w:val="left"/>
+            </w:pPr>
+            <w:r>
+              <w:t xml:space="preserve">2019 SB499</w:t>
+            </w:r>
+          </w:p>
+        </w:tc>
+        <w:tc>
+          <w:tcPr/>
+          <w:p>
+            <w:pPr>
+              <w:pStyle w:val="Compact"/>
+              <w:jc w:val="left"/>
+            </w:pPr>
+            <w:r>
+              <w:t xml:space="preserve">Would have created a new state advisory board for water planning</w:t>
+            </w:r>
+          </w:p>
+        </w:tc>
+        <w:tc>
+          <w:tcPr/>
+          <w:p>
+            <w:pPr>
+              <w:pStyle w:val="Compact"/>
+              <w:jc w:val="left"/>
+            </w:pPr>
+            <w:r>
+              <w:t xml:space="preserve">Failed</w:t>
+            </w:r>
+          </w:p>
+        </w:tc>
+        <w:tc>
+          <w:tcPr/>
+          <w:p>
+            <w:pPr>
+              <w:pStyle w:val="Compact"/>
+              <w:jc w:val="left"/>
+            </w:pPr>
+            <w:r>
+              <w:t xml:space="preserve">Died in its first committee</w:t>
+            </w:r>
+          </w:p>
+        </w:tc>
+      </w:tr>
+      <w:tr>
+        <w:tc>
+          <w:tcPr/>
+          <w:p>
+            <w:pPr>
+              <w:pStyle w:val="Compact"/>
+              <w:jc w:val="left"/>
+            </w:pPr>
+            <w:r>
+              <w:t xml:space="preserve">2025 SB143</w:t>
+            </w:r>
+          </w:p>
+        </w:tc>
+        <w:tc>
+          <w:tcPr/>
+          <w:p>
+            <w:pPr>
+              <w:pStyle w:val="Compact"/>
+              <w:jc w:val="left"/>
+            </w:pPr>
+            <w:r>
+              <w:t xml:space="preserve">Planned a review of water saving, plus a fake-grass study — passed the Senate 21-0, died in the Assembly</w:t>
+            </w:r>
+          </w:p>
+        </w:tc>
+        <w:tc>
+          <w:tcPr/>
+          <w:p>
+            <w:pPr>
+              <w:pStyle w:val="Compact"/>
+              <w:jc w:val="left"/>
+            </w:pPr>
+            <w:r>
+              <w:t xml:space="preserve">Failed</w:t>
+            </w:r>
+          </w:p>
+        </w:tc>
+        <w:tc>
+          <w:tcPr/>
+          <w:p>
+            <w:pPr>
+              <w:pStyle w:val="Compact"/>
+              <w:jc w:val="left"/>
+            </w:pPr>
+            <w:r>
+              <w:t xml:space="preserve">Died in the second house</w:t>
+            </w:r>
+          </w:p>
+        </w:tc>
+      </w:tr>
+    </w:tbl>
+    <w:p>
+      <w:pPr>
+        <w:pStyle w:val="BodyText"/>
+      </w:pPr>
+      <w:r>
+        <w:rPr>
+          <w:bCs/>
+          <w:b/>
+        </w:rPr>
+        <w:t xml:space="preserve">Open questions for a working group:</w:t>
+      </w:r>
+      <w:r>
+        <w:t xml:space="preserve"> </w:t>
+      </w:r>
+      <w:r>
+        <w:t xml:space="preserve">- What changed between the 2019 and 2025 failures?</w:t>
+      </w:r>
+      <w:r>
+        <w:t xml:space="preserve"> </w:t>
+      </w:r>
+      <w:r>
+        <w:t xml:space="preserve">- Citizens’ stated reason is that the legislature meets every other year - does an interim body answer that or duplicate existing interim committees?</w:t>
+      </w:r>
+    </w:p>
+    <w:bookmarkEnd w:id="45"/>
+    <w:bookmarkStart w:id="46" w:name="X6c5260f3a2184bd06de85dc4a3a48ecb6168928"/>
+    <w:p>
+      <w:pPr>
+        <w:pStyle w:val="Heading2"/>
+      </w:pPr>
+      <w:r>
+        <w:t xml:space="preserve">2. Statewide guardrails on data centers: closed-loop cooling only, no evaporative cooling, pay for their own power; stop the county-by-county race to the bottom.</w:t>
+      </w:r>
+    </w:p>
+    <w:p>
+      <w:pPr>
+        <w:numPr>
+          <w:ilvl w:val="0"/>
+          <w:numId w:val="1013"/>
+        </w:numPr>
+        <w:pStyle w:val="Compact"/>
+      </w:pPr>
+      <w:r>
+        <w:rPr>
+          <w:bCs/>
+          <w:b/>
+        </w:rPr>
+        <w:t xml:space="preserve">Status:</w:t>
+      </w:r>
+      <w:r>
+        <w:t xml:space="preserve"> </w:t>
+      </w:r>
+      <w:r>
+        <w:t xml:space="preserve">Never filed</w:t>
+      </w:r>
+    </w:p>
+    <w:p>
+      <w:pPr>
+        <w:numPr>
+          <w:ilvl w:val="0"/>
+          <w:numId w:val="1013"/>
+        </w:numPr>
+        <w:pStyle w:val="Compact"/>
+      </w:pPr>
+      <w:r>
+        <w:rPr>
+          <w:bCs/>
+          <w:b/>
+        </w:rPr>
+        <w:t xml:space="preserve">The record:</w:t>
+      </w:r>
+      <w:r>
+        <w:t xml:space="preserve"> </w:t>
+      </w:r>
+      <w:r>
+        <w:t xml:space="preserve">No bill has ever proposed state water or cooling rules for data centers. Bills helping large users went 4-for-4 (80:SB547, 80:AB400, 81:AB66, 82:AB261). Bills restraining their tax deals went 0-for-5 (83:AB77, 82:SB394, 82:SB429 vetoed, 81:AB449, 83:SB364). The one cooling bill (83:AB385) pushed the opposite way - blocking local cooling-tower bans - and died in first committee.</w:t>
+      </w:r>
+    </w:p>
+    <w:p>
+      <w:pPr>
+        <w:numPr>
+          <w:ilvl w:val="0"/>
+          <w:numId w:val="1013"/>
+        </w:numPr>
+        <w:pStyle w:val="Compact"/>
+      </w:pPr>
+      <w:r>
+        <w:rPr>
+          <w:bCs/>
+          <w:b/>
+        </w:rPr>
+        <w:t xml:space="preserve">Where the decision sits:</w:t>
+      </w:r>
+      <w:r>
+        <w:t xml:space="preserve"> </w:t>
+      </w:r>
+      <w:r>
+        <w:t xml:space="preserve">The citizens’ jurisdictional complaint is accurate: today cooling rules are local (SNWA moratorium is a water-authority rule; TRIC has its own water company). A statewide rule would be new statutory ground. 2026 interim study feeds the 2027 session.</w:t>
+      </w:r>
+    </w:p>
+    <w:tbl>
+      <w:tblPr>
+        <w:tblStyle w:val="Table"/>
+        <w:tblW w:type="pct" w:w="5000"/>
+        <w:tblLook w:firstRow="1" w:lastRow="0" w:firstColumn="0" w:lastColumn="0" w:noHBand="0" w:noVBand="0" w:val="0020"/>
+        <w:jc w:val="start"/>
+      </w:tblPr>
+      <w:tblGrid>
+        <w:gridCol w:w="1980"/>
+        <w:gridCol w:w="1980"/>
+        <w:gridCol w:w="1980"/>
+        <w:gridCol w:w="1980"/>
+      </w:tblGrid>
+      <w:tr>
+        <w:trPr>
+          <w:tblHeader w:val="true"/>
+        </w:trPr>
+        <w:tc>
+          <w:tcPr/>
+          <w:p>
+            <w:pPr>
+              <w:pStyle w:val="Compact"/>
+              <w:jc w:val="left"/>
+            </w:pPr>
+            <w:r>
+              <w:t xml:space="preserve">Bill</w:t>
+            </w:r>
+          </w:p>
+        </w:tc>
+        <w:tc>
+          <w:tcPr/>
+          <w:p>
+            <w:pPr>
+              <w:pStyle w:val="Compact"/>
+              <w:jc w:val="left"/>
+            </w:pPr>
+            <w:r>
+              <w:t xml:space="preserve">What it tried</w:t>
+            </w:r>
+          </w:p>
+        </w:tc>
+        <w:tc>
+          <w:tcPr/>
+          <w:p>
+            <w:pPr>
+              <w:pStyle w:val="Compact"/>
+              <w:jc w:val="left"/>
+            </w:pPr>
+            <w:r>
+              <w:t xml:space="preserve">Result</w:t>
+            </w:r>
+          </w:p>
+        </w:tc>
+        <w:tc>
+          <w:tcPr/>
+          <w:p>
+            <w:pPr>
+              <w:pStyle w:val="Compact"/>
+              <w:jc w:val="left"/>
+            </w:pPr>
+            <w:r>
+              <w:t xml:space="preserve">Where it ended</w:t>
+            </w:r>
+          </w:p>
+        </w:tc>
+      </w:tr>
+      <w:tr>
+        <w:tc>
+          <w:tcPr/>
+          <w:p>
+            <w:pPr>
+              <w:pStyle w:val="Compact"/>
+              <w:jc w:val="left"/>
+            </w:pPr>
+            <w:r>
+              <w:t xml:space="preserve">2019 SB547</w:t>
+            </w:r>
+          </w:p>
+        </w:tc>
+        <w:tc>
+          <w:tcPr/>
+          <w:p>
+            <w:pPr>
+              <w:pStyle w:val="Compact"/>
+              <w:jc w:val="left"/>
+            </w:pPr>
+            <w:r>
+              <w:t xml:space="preserve">Let data centers run their own electric equipment without being regulated as utilities</w:t>
+            </w:r>
+          </w:p>
+        </w:tc>
+        <w:tc>
+          <w:tcPr/>
+          <w:p>
+            <w:pPr>
+              <w:pStyle w:val="Compact"/>
+              <w:jc w:val="left"/>
+            </w:pPr>
+            <w:r>
+              <w:t xml:space="preserve">Enacted</w:t>
+            </w:r>
+          </w:p>
+        </w:tc>
+        <w:tc>
+          <w:tcPr/>
+          <w:p>
+            <w:pPr>
+              <w:pStyle w:val="Compact"/>
+              <w:jc w:val="left"/>
+            </w:pPr>
+            <w:r>
+              <w:t xml:space="preserve">Became law</w:t>
+            </w:r>
+          </w:p>
+        </w:tc>
+      </w:tr>
+      <w:tr>
+        <w:tc>
+          <w:tcPr/>
+          <w:p>
+            <w:pPr>
+              <w:pStyle w:val="Compact"/>
+              <w:jc w:val="left"/>
+            </w:pPr>
+            <w:r>
+              <w:t xml:space="preserve">2019 AB400</w:t>
+            </w:r>
+          </w:p>
+        </w:tc>
+        <w:tc>
+          <w:tcPr/>
+          <w:p>
+            <w:pPr>
+              <w:pStyle w:val="Compact"/>
+              <w:jc w:val="left"/>
+            </w:pPr>
+            <w:r>
+              <w:t xml:space="preserve">Changed tax-break rules for big projects, including how data centers get school-tax breaks</w:t>
+            </w:r>
+          </w:p>
+        </w:tc>
+        <w:tc>
+          <w:tcPr/>
+          <w:p>
+            <w:pPr>
+              <w:pStyle w:val="Compact"/>
+              <w:jc w:val="left"/>
+            </w:pPr>
+            <w:r>
+              <w:t xml:space="preserve">Enacted</w:t>
+            </w:r>
+          </w:p>
+        </w:tc>
+        <w:tc>
+          <w:tcPr/>
+          <w:p>
+            <w:pPr>
+              <w:pStyle w:val="Compact"/>
+              <w:jc w:val="left"/>
+            </w:pPr>
+            <w:r>
+              <w:t xml:space="preserve">Became law</w:t>
+            </w:r>
+          </w:p>
+        </w:tc>
+      </w:tr>
+      <w:tr>
+        <w:tc>
+          <w:tcPr/>
+          <w:p>
+            <w:pPr>
+              <w:pStyle w:val="Compact"/>
+              <w:jc w:val="left"/>
+            </w:pPr>
+            <w:r>
+              <w:t xml:space="preserve">2021 AB66</w:t>
+            </w:r>
+          </w:p>
+        </w:tc>
+        <w:tc>
+          <w:tcPr/>
+          <w:p>
+            <w:pPr>
+              <w:pStyle w:val="Compact"/>
+              <w:jc w:val="left"/>
+            </w:pPr>
+            <w:r>
+              <w:t xml:space="preserve">Housekeeping changes to tax-break start dates (data-center statutes included)</w:t>
+            </w:r>
+          </w:p>
+        </w:tc>
+        <w:tc>
+          <w:tcPr/>
+          <w:p>
+            <w:pPr>
+              <w:pStyle w:val="Compact"/>
+              <w:jc w:val="left"/>
+            </w:pPr>
+            <w:r>
+              <w:t xml:space="preserve">Enacted</w:t>
+            </w:r>
+          </w:p>
+        </w:tc>
+        <w:tc>
+          <w:tcPr/>
+          <w:p>
+            <w:pPr>
+              <w:pStyle w:val="Compact"/>
+              <w:jc w:val="left"/>
+            </w:pPr>
+            <w:r>
+              <w:t xml:space="preserve">Became law</w:t>
+            </w:r>
+          </w:p>
+        </w:tc>
+      </w:tr>
+      <w:tr>
+        <w:tc>
+          <w:tcPr/>
+          <w:p>
+            <w:pPr>
+              <w:pStyle w:val="Compact"/>
+              <w:jc w:val="left"/>
+            </w:pPr>
+            <w:r>
+              <w:t xml:space="preserve">2023 AB261</w:t>
+            </w:r>
+          </w:p>
+        </w:tc>
+        <w:tc>
+          <w:tcPr/>
+          <w:p>
+            <w:pPr>
+              <w:pStyle w:val="Compact"/>
+              <w:jc w:val="left"/>
+            </w:pPr>
+            <w:r>
+              <w:t xml:space="preserve">Made the state economic development plan address efficient use of water</w:t>
+            </w:r>
+          </w:p>
+        </w:tc>
+        <w:tc>
+          <w:tcPr/>
+          <w:p>
+            <w:pPr>
+              <w:pStyle w:val="Compact"/>
+              <w:jc w:val="left"/>
+            </w:pPr>
+            <w:r>
+              <w:t xml:space="preserve">Enacted</w:t>
+            </w:r>
+          </w:p>
+        </w:tc>
+        <w:tc>
+          <w:tcPr/>
+          <w:p>
+            <w:pPr>
+              <w:pStyle w:val="Compact"/>
+              <w:jc w:val="left"/>
+            </w:pPr>
+            <w:r>
+              <w:t xml:space="preserve">Became law</w:t>
+            </w:r>
+          </w:p>
+        </w:tc>
+      </w:tr>
+      <w:tr>
+        <w:tc>
+          <w:tcPr/>
+          <w:p>
+            <w:pPr>
+              <w:pStyle w:val="Compact"/>
+              <w:jc w:val="left"/>
+            </w:pPr>
+            <w:r>
+              <w:t xml:space="preserve">2025 AB77</w:t>
+            </w:r>
+          </w:p>
+        </w:tc>
+        <w:tc>
+          <w:tcPr/>
+          <w:p>
+            <w:pPr>
+              <w:pStyle w:val="Compact"/>
+              <w:jc w:val="left"/>
+            </w:pPr>
+            <w:r>
+              <w:t xml:space="preserve">Would have added grounds to deny business tax breaks, with data centers named — died in first committee</w:t>
+            </w:r>
+          </w:p>
+        </w:tc>
+        <w:tc>
+          <w:tcPr/>
+          <w:p>
+            <w:pPr>
+              <w:pStyle w:val="Compact"/>
+              <w:jc w:val="left"/>
+            </w:pPr>
+            <w:r>
+              <w:t xml:space="preserve">Failed</w:t>
+            </w:r>
+          </w:p>
+        </w:tc>
+        <w:tc>
+          <w:tcPr/>
+          <w:p>
+            <w:pPr>
+              <w:pStyle w:val="Compact"/>
+              <w:jc w:val="left"/>
+            </w:pPr>
+            <w:r>
+              <w:t xml:space="preserve">Died in its first committee</w:t>
+            </w:r>
+          </w:p>
+        </w:tc>
+      </w:tr>
+      <w:tr>
+        <w:tc>
+          <w:tcPr/>
+          <w:p>
+            <w:pPr>
+              <w:pStyle w:val="Compact"/>
+              <w:jc w:val="left"/>
+            </w:pPr>
+            <w:r>
+              <w:t xml:space="preserve">2023 SB394</w:t>
+            </w:r>
+          </w:p>
+        </w:tc>
+        <w:tc>
+          <w:tcPr/>
+          <w:p>
+            <w:pPr>
+              <w:pStyle w:val="Compact"/>
+              <w:jc w:val="left"/>
+            </w:pPr>
+            <w:r>
+              <w:t xml:space="preserve">Would have capped big business tax breaks (data-center statutes included) at $500,000 — passed the Senate 14-7, died in the Assembly</w:t>
+            </w:r>
+          </w:p>
+        </w:tc>
+        <w:tc>
+          <w:tcPr/>
+          <w:p>
+            <w:pPr>
+              <w:pStyle w:val="Compact"/>
+              <w:jc w:val="left"/>
+            </w:pPr>
+            <w:r>
+              <w:t xml:space="preserve">Failed</w:t>
+            </w:r>
+          </w:p>
+        </w:tc>
+        <w:tc>
+          <w:tcPr/>
+          <w:p>
+            <w:pPr>
+              <w:pStyle w:val="Compact"/>
+              <w:jc w:val="left"/>
+            </w:pPr>
+            <w:r>
+              <w:t xml:space="preserve">Died in the second house</w:t>
+            </w:r>
+          </w:p>
+        </w:tc>
+      </w:tr>
+      <w:tr>
+        <w:tc>
+          <w:tcPr/>
+          <w:p>
+            <w:pPr>
+              <w:pStyle w:val="Compact"/>
+              <w:jc w:val="left"/>
+            </w:pPr>
+            <w:r>
+              <w:t xml:space="preserve">2023 SB429</w:t>
+            </w:r>
+          </w:p>
+        </w:tc>
+        <w:tc>
+          <w:tcPr/>
+          <w:p>
+            <w:pPr>
+              <w:pStyle w:val="Compact"/>
+              <w:jc w:val="left"/>
+            </w:pPr>
+            <w:r>
+              <w:t xml:space="preserve">Would have tied big tax breaks to paid family leave — vetoed</w:t>
+            </w:r>
+          </w:p>
+        </w:tc>
+        <w:tc>
+          <w:tcPr/>
+          <w:p>
+            <w:pPr>
+              <w:pStyle w:val="Compact"/>
+              <w:jc w:val="left"/>
+            </w:pPr>
+            <w:r>
+              <w:t xml:space="preserve">Vetoed</w:t>
+            </w:r>
+          </w:p>
+        </w:tc>
+        <w:tc>
+          <w:tcPr/>
+          <w:p>
+            <w:pPr>
+              <w:pStyle w:val="Compact"/>
+              <w:jc w:val="left"/>
+            </w:pPr>
+            <w:r>
+              <w:t xml:space="preserve">Vetoed by the governor</w:t>
+            </w:r>
+          </w:p>
+        </w:tc>
+      </w:tr>
+      <w:tr>
+        <w:tc>
+          <w:tcPr/>
+          <w:p>
+            <w:pPr>
+              <w:pStyle w:val="Compact"/>
+              <w:jc w:val="left"/>
+            </w:pPr>
+            <w:r>
+              <w:t xml:space="preserve">2021 AB449</w:t>
+            </w:r>
+          </w:p>
+        </w:tc>
+        <w:tc>
+          <w:tcPr/>
+          <w:p>
+            <w:pPr>
+              <w:pStyle w:val="Compact"/>
+              <w:jc w:val="left"/>
+            </w:pPr>
+            <w:r>
+              <w:t xml:space="preserve">Would have tightened the agreements businesses sign to get big tax breaks (data-center statutes included)</w:t>
+            </w:r>
+          </w:p>
+        </w:tc>
+        <w:tc>
+          <w:tcPr/>
+          <w:p>
+            <w:pPr>
+              <w:pStyle w:val="Compact"/>
+              <w:jc w:val="left"/>
+            </w:pPr>
+            <w:r>
+              <w:t xml:space="preserve">Failed</w:t>
+            </w:r>
+          </w:p>
+        </w:tc>
+        <w:tc>
+          <w:tcPr/>
+          <w:p>
+            <w:pPr>
+              <w:pStyle w:val="Compact"/>
+              <w:jc w:val="left"/>
+            </w:pPr>
+            <w:r>
+              <w:t xml:space="preserve">Died in its first committee</w:t>
+            </w:r>
+          </w:p>
+        </w:tc>
+      </w:tr>
+      <w:tr>
+        <w:tc>
+          <w:tcPr/>
+          <w:p>
+            <w:pPr>
+              <w:pStyle w:val="Compact"/>
+              <w:jc w:val="left"/>
+            </w:pPr>
+            <w:r>
+              <w:t xml:space="preserve">2025 SB364</w:t>
+            </w:r>
+          </w:p>
+        </w:tc>
+        <w:tc>
+          <w:tcPr/>
+          <w:p>
+            <w:pPr>
+              <w:pStyle w:val="Compact"/>
+              <w:jc w:val="left"/>
+            </w:pPr>
+            <w:r>
+              <w:t xml:space="preserve">Would have expanded business tax breaks (data-center statutes included)</w:t>
+            </w:r>
+          </w:p>
+        </w:tc>
+        <w:tc>
+          <w:tcPr/>
+          <w:p>
+            <w:pPr>
+              <w:pStyle w:val="Compact"/>
+              <w:jc w:val="left"/>
+            </w:pPr>
+            <w:r>
+              <w:t xml:space="preserve">Failed</w:t>
+            </w:r>
+          </w:p>
+        </w:tc>
+        <w:tc>
+          <w:tcPr/>
+          <w:p>
+            <w:pPr>
+              <w:pStyle w:val="Compact"/>
+              <w:jc w:val="left"/>
+            </w:pPr>
+            <w:r>
+              <w:t xml:space="preserve">Died on its first floor / calendar</w:t>
+            </w:r>
+          </w:p>
+        </w:tc>
+      </w:tr>
+      <w:tr>
+        <w:tc>
+          <w:tcPr/>
+          <w:p>
+            <w:pPr>
+              <w:pStyle w:val="Compact"/>
+              <w:jc w:val="left"/>
+            </w:pPr>
+            <w:r>
+              <w:t xml:space="preserve">2025 AB385</w:t>
+            </w:r>
+          </w:p>
+        </w:tc>
+        <w:tc>
+          <w:tcPr/>
+          <w:p>
+            <w:pPr>
+              <w:pStyle w:val="Compact"/>
+              <w:jc w:val="left"/>
+            </w:pPr>
+            <w:r>
+              <w:t xml:space="preserve">Would have blocked cities and counties from banning big water-based cooling towers — died in first committee</w:t>
+            </w:r>
+          </w:p>
+        </w:tc>
+        <w:tc>
+          <w:tcPr/>
+          <w:p>
+            <w:pPr>
+              <w:pStyle w:val="Compact"/>
+              <w:jc w:val="left"/>
+            </w:pPr>
+            <w:r>
+              <w:t xml:space="preserve">Failed</w:t>
+            </w:r>
+          </w:p>
+        </w:tc>
+        <w:tc>
+          <w:tcPr/>
+          <w:p>
+            <w:pPr>
+              <w:pStyle w:val="Compact"/>
+              <w:jc w:val="left"/>
+            </w:pPr>
+            <w:r>
+              <w:t xml:space="preserve">Died in its first committee</w:t>
+            </w:r>
+          </w:p>
+        </w:tc>
+      </w:tr>
+    </w:tbl>
+    <w:p>
+      <w:pPr>
+        <w:pStyle w:val="BodyText"/>
+      </w:pPr>
+      <w:r>
+        <w:rPr>
+          <w:bCs/>
+          <w:b/>
+        </w:rPr>
+        <w:t xml:space="preserve">Open questions for a working group:</w:t>
+      </w:r>
+      <w:r>
+        <w:t xml:space="preserve"> </w:t>
+      </w:r>
+      <w:r>
+        <w:t xml:space="preserve">- Which committee owns a 2027 bill - Natural Resources (water) or Revenue (tax deals)?</w:t>
+      </w:r>
+      <w:r>
+        <w:t xml:space="preserve"> </w:t>
+      </w:r>
+      <w:r>
+        <w:t xml:space="preserve">- Closed-loop cooling raises electricity use - who owns the power half?</w:t>
+      </w:r>
+    </w:p>
+    <w:bookmarkEnd w:id="46"/>
+    <w:bookmarkStart w:id="47" w:name="Xe4773a235fa3643dc3eea568b20b376399f9208"/>
+    <w:p>
+      <w:pPr>
+        <w:pStyle w:val="Heading2"/>
+      </w:pPr>
+      <w:r>
+        <w:t xml:space="preserve">3. Audit and inventory water, fix over-allocation, digitize the records - the state knows about half its basins and was still on paper books in 2021.</w:t>
+      </w:r>
+    </w:p>
+    <w:p>
+      <w:pPr>
+        <w:numPr>
+          <w:ilvl w:val="0"/>
+          <w:numId w:val="1014"/>
+        </w:numPr>
+        <w:pStyle w:val="Compact"/>
+      </w:pPr>
+      <w:r>
+        <w:rPr>
+          <w:bCs/>
+          <w:b/>
+        </w:rPr>
+        <w:t xml:space="preserve">Status:</w:t>
+      </w:r>
+      <w:r>
+        <w:t xml:space="preserve"> </w:t>
+      </w:r>
+      <w:r>
+        <w:t xml:space="preserve">Tried and stalled; pieces passed</w:t>
+      </w:r>
+    </w:p>
+    <w:p>
+      <w:pPr>
+        <w:numPr>
+          <w:ilvl w:val="0"/>
+          <w:numId w:val="1014"/>
+        </w:numPr>
+        <w:pStyle w:val="Compact"/>
+      </w:pPr>
+      <w:r>
+        <w:rPr>
+          <w:bCs/>
+          <w:b/>
+        </w:rPr>
+        <w:t xml:space="preserve">The record:</w:t>
+      </w:r>
+      <w:r>
+        <w:t xml:space="preserve"> </w:t>
+      </w:r>
+      <w:r>
+        <w:t xml:space="preserve">Citizens said such bills</w:t>
+      </w:r>
+      <w:r>
+        <w:t xml:space="preserve"> </w:t>
+      </w:r>
+      <w:r>
+        <w:t xml:space="preserve">‘</w:t>
+      </w:r>
+      <w:r>
+        <w:t xml:space="preserve">keep getting shut down in committee</w:t>
+      </w:r>
+      <w:r>
+        <w:t xml:space="preserve">’</w:t>
+      </w:r>
+      <w:r>
+        <w:t xml:space="preserve"> </w:t>
+      </w:r>
+      <w:r>
+        <w:t xml:space="preserve">- the record agrees. 2025 AB485 would have funded basin water budgets, monitoring, digitization of Division records, and staff to adjudicate old claims; it died in its first committee. What did pass: 2019 AB95 (groundwater basin studies), 2023 SB113 (critical management areas, domestic-well meters), 2025 AB577 (money for the water agency’s new website and database), 2025 SB36 (buy-and-retire over-allocated rights).</w:t>
+      </w:r>
+    </w:p>
+    <w:p>
+      <w:pPr>
+        <w:numPr>
+          <w:ilvl w:val="0"/>
+          <w:numId w:val="1014"/>
+        </w:numPr>
+        <w:pStyle w:val="Compact"/>
+      </w:pPr>
+      <w:r>
+        <w:rPr>
+          <w:bCs/>
+          <w:b/>
+        </w:rPr>
+        <w:t xml:space="preserve">Where the decision sits:</w:t>
+      </w:r>
+      <w:r>
+        <w:t xml:space="preserve"> </w:t>
+      </w:r>
+      <w:r>
+        <w:t xml:space="preserve">Fully state-level: the Division of Water Resources’ funding and duties are set by statute and budget.</w:t>
+      </w:r>
+    </w:p>
+    <w:tbl>
+      <w:tblPr>
+        <w:tblStyle w:val="Table"/>
+        <w:tblW w:type="pct" w:w="5000"/>
+        <w:tblLook w:firstRow="1" w:lastRow="0" w:firstColumn="0" w:lastColumn="0" w:noHBand="0" w:noVBand="0" w:val="0020"/>
+        <w:jc w:val="start"/>
+      </w:tblPr>
+      <w:tblGrid>
+        <w:gridCol w:w="1980"/>
+        <w:gridCol w:w="1980"/>
+        <w:gridCol w:w="1980"/>
+        <w:gridCol w:w="1980"/>
+      </w:tblGrid>
+      <w:tr>
+        <w:trPr>
+          <w:tblHeader w:val="true"/>
+        </w:trPr>
+        <w:tc>
+          <w:tcPr/>
+          <w:p>
+            <w:pPr>
+              <w:pStyle w:val="Compact"/>
+              <w:jc w:val="left"/>
+            </w:pPr>
+            <w:r>
+              <w:t xml:space="preserve">Bill</w:t>
+            </w:r>
+          </w:p>
+        </w:tc>
+        <w:tc>
+          <w:tcPr/>
+          <w:p>
+            <w:pPr>
+              <w:pStyle w:val="Compact"/>
+              <w:jc w:val="left"/>
+            </w:pPr>
+            <w:r>
+              <w:t xml:space="preserve">What it tried</w:t>
+            </w:r>
+          </w:p>
+        </w:tc>
+        <w:tc>
+          <w:tcPr/>
+          <w:p>
+            <w:pPr>
+              <w:pStyle w:val="Compact"/>
+              <w:jc w:val="left"/>
+            </w:pPr>
+            <w:r>
+              <w:t xml:space="preserve">Result</w:t>
+            </w:r>
+          </w:p>
+        </w:tc>
+        <w:tc>
+          <w:tcPr/>
+          <w:p>
+            <w:pPr>
+              <w:pStyle w:val="Compact"/>
+              <w:jc w:val="left"/>
+            </w:pPr>
+            <w:r>
+              <w:t xml:space="preserve">Where it ended</w:t>
+            </w:r>
+          </w:p>
+        </w:tc>
+      </w:tr>
+      <w:tr>
+        <w:tc>
+          <w:tcPr/>
+          <w:p>
+            <w:pPr>
+              <w:pStyle w:val="Compact"/>
+              <w:jc w:val="left"/>
+            </w:pPr>
+            <w:r>
+              <w:t xml:space="preserve">2025 AB485</w:t>
+            </w:r>
+          </w:p>
+        </w:tc>
+        <w:tc>
+          <w:tcPr/>
+          <w:p>
+            <w:pPr>
+              <w:pStyle w:val="Compact"/>
+              <w:jc w:val="left"/>
+            </w:pPr>
+            <w:r>
+              <w:t xml:space="preserve">Would have funded groundwater basin budgets, monitoring, digitizing water records, and staff to sort old water rights claims — died in first committee</w:t>
+            </w:r>
+          </w:p>
+        </w:tc>
+        <w:tc>
+          <w:tcPr/>
+          <w:p>
+            <w:pPr>
+              <w:pStyle w:val="Compact"/>
+              <w:jc w:val="left"/>
+            </w:pPr>
+            <w:r>
+              <w:t xml:space="preserve">Failed</w:t>
+            </w:r>
+          </w:p>
+        </w:tc>
+        <w:tc>
+          <w:tcPr/>
+          <w:p>
+            <w:pPr>
+              <w:pStyle w:val="Compact"/>
+              <w:jc w:val="left"/>
+            </w:pPr>
+            <w:r>
+              <w:t xml:space="preserve">Died in its first committee</w:t>
+            </w:r>
+          </w:p>
+        </w:tc>
+      </w:tr>
+      <w:tr>
+        <w:tc>
+          <w:tcPr/>
+          <w:p>
+            <w:pPr>
+              <w:pStyle w:val="Compact"/>
+              <w:jc w:val="left"/>
+            </w:pPr>
+            <w:r>
+              <w:t xml:space="preserve">2019 AB95</w:t>
+            </w:r>
+          </w:p>
+        </w:tc>
+        <w:tc>
+          <w:tcPr/>
+          <w:p>
+            <w:pPr>
+              <w:pStyle w:val="Compact"/>
+              <w:jc w:val="left"/>
+            </w:pPr>
+            <w:r>
+              <w:t xml:space="preserve">Told the State Engineer how to study groundwater basins that may not refill fast enough</w:t>
+            </w:r>
+          </w:p>
+        </w:tc>
+        <w:tc>
+          <w:tcPr/>
+          <w:p>
+            <w:pPr>
+              <w:pStyle w:val="Compact"/>
+              <w:jc w:val="left"/>
+            </w:pPr>
+            <w:r>
+              <w:t xml:space="preserve">Enacted</w:t>
+            </w:r>
+          </w:p>
+        </w:tc>
+        <w:tc>
+          <w:tcPr/>
+          <w:p>
+            <w:pPr>
+              <w:pStyle w:val="Compact"/>
+              <w:jc w:val="left"/>
+            </w:pPr>
+            <w:r>
+              <w:t xml:space="preserve">Became law</w:t>
+            </w:r>
+          </w:p>
+        </w:tc>
+      </w:tr>
+      <w:tr>
+        <w:tc>
+          <w:tcPr/>
+          <w:p>
+            <w:pPr>
+              <w:pStyle w:val="Compact"/>
+              <w:jc w:val="left"/>
+            </w:pPr>
+            <w:r>
+              <w:t xml:space="preserve">2023 SB113</w:t>
+            </w:r>
+          </w:p>
+        </w:tc>
+        <w:tc>
+          <w:tcPr/>
+          <w:p>
+            <w:pPr>
+              <w:pStyle w:val="Compact"/>
+              <w:jc w:val="left"/>
+            </w:pPr>
+            <w:r>
+              <w:t xml:space="preserve">Changed how over-pumped groundwater areas get named</w:t>
+            </w:r>
+            <w:r>
+              <w:t xml:space="preserve"> </w:t>
+            </w:r>
+            <w:r>
+              <w:t xml:space="preserve">‘</w:t>
+            </w:r>
+            <w:r>
+              <w:t xml:space="preserve">critical management areas</w:t>
+            </w:r>
+            <w:r>
+              <w:t xml:space="preserve">’</w:t>
+            </w:r>
+          </w:p>
+        </w:tc>
+        <w:tc>
+          <w:tcPr/>
+          <w:p>
+            <w:pPr>
+              <w:pStyle w:val="Compact"/>
+              <w:jc w:val="left"/>
+            </w:pPr>
+            <w:r>
+              <w:t xml:space="preserve">Enacted</w:t>
+            </w:r>
+          </w:p>
+        </w:tc>
+        <w:tc>
+          <w:tcPr/>
+          <w:p>
+            <w:pPr>
+              <w:pStyle w:val="Compact"/>
+              <w:jc w:val="left"/>
+            </w:pPr>
+            <w:r>
+              <w:t xml:space="preserve">Became law</w:t>
+            </w:r>
+          </w:p>
+        </w:tc>
+      </w:tr>
+      <w:tr>
+        <w:tc>
+          <w:tcPr/>
+          <w:p>
+            <w:pPr>
+              <w:pStyle w:val="Compact"/>
+              <w:jc w:val="left"/>
+            </w:pPr>
+            <w:r>
+              <w:t xml:space="preserve">2025 AB577</w:t>
+            </w:r>
+          </w:p>
+        </w:tc>
+        <w:tc>
+          <w:tcPr/>
+          <w:p>
+            <w:pPr>
+              <w:pStyle w:val="Compact"/>
+              <w:jc w:val="left"/>
+            </w:pPr>
+            <w:r>
+              <w:t xml:space="preserve">Money for the state water agency’s website, database, vehicles, and computers</w:t>
+            </w:r>
+          </w:p>
+        </w:tc>
+        <w:tc>
+          <w:tcPr/>
+          <w:p>
+            <w:pPr>
+              <w:pStyle w:val="Compact"/>
+              <w:jc w:val="left"/>
+            </w:pPr>
+            <w:r>
+              <w:t xml:space="preserve">Enacted</w:t>
+            </w:r>
+          </w:p>
+        </w:tc>
+        <w:tc>
+          <w:tcPr/>
+          <w:p>
+            <w:pPr>
+              <w:pStyle w:val="Compact"/>
+              <w:jc w:val="left"/>
+            </w:pPr>
+            <w:r>
+              <w:t xml:space="preserve">Became law</w:t>
+            </w:r>
+          </w:p>
+        </w:tc>
+      </w:tr>
+      <w:tr>
+        <w:tc>
+          <w:tcPr/>
+          <w:p>
+            <w:pPr>
+              <w:pStyle w:val="Compact"/>
+              <w:jc w:val="left"/>
+            </w:pPr>
+            <w:r>
+              <w:t xml:space="preserve">2025 SB36</w:t>
+            </w:r>
+          </w:p>
+        </w:tc>
+        <w:tc>
+          <w:tcPr/>
+          <w:p>
+            <w:pPr>
+              <w:pStyle w:val="Compact"/>
+              <w:jc w:val="left"/>
+            </w:pPr>
+            <w:r>
+              <w:t xml:space="preserve">Set up a state account to buy water rights in over-used groundwater areas and retire them for good</w:t>
+            </w:r>
+          </w:p>
+        </w:tc>
+        <w:tc>
+          <w:tcPr/>
+          <w:p>
+            <w:pPr>
+              <w:pStyle w:val="Compact"/>
+              <w:jc w:val="left"/>
+            </w:pPr>
+            <w:r>
+              <w:t xml:space="preserve">Enacted</w:t>
+            </w:r>
+          </w:p>
+        </w:tc>
+        <w:tc>
+          <w:tcPr/>
+          <w:p>
+            <w:pPr>
+              <w:pStyle w:val="Compact"/>
+              <w:jc w:val="left"/>
+            </w:pPr>
+            <w:r>
+              <w:t xml:space="preserve">Became law</w:t>
+            </w:r>
+          </w:p>
+        </w:tc>
+      </w:tr>
+    </w:tbl>
+    <w:p>
+      <w:pPr>
+        <w:pStyle w:val="BodyText"/>
+      </w:pPr>
+      <w:r>
+        <w:rPr>
+          <w:bCs/>
+          <w:b/>
+        </w:rPr>
+        <w:t xml:space="preserve">Open questions for a working group:</w:t>
+      </w:r>
+      <w:r>
+        <w:t xml:space="preserve"> </w:t>
+      </w:r>
+      <w:r>
+        <w:t xml:space="preserve">- AB485 packaged funding + digitization + adjudication staff. Which piece drew the opposition?</w:t>
+      </w:r>
+      <w:r>
+        <w:t xml:space="preserve"> </w:t>
+      </w:r>
+      <w:r>
+        <w:t xml:space="preserve">- Does AB577’s database money cover what citizens mean by digitization, or just IT replacement?</w:t>
+      </w:r>
+    </w:p>
+    <w:bookmarkEnd w:id="47"/>
+    <w:bookmarkStart w:id="48" w:name="X8647deaa7edfeee82a2b84d47fb01c181e3c144"/>
+    <w:p>
+      <w:pPr>
+        <w:pStyle w:val="Heading2"/>
+      </w:pPr>
+      <w:r>
+        <w:t xml:space="preserve">4. Meter water use and use the data to catch leaks and overuse - metered water means people use less.</w:t>
+      </w:r>
+    </w:p>
+    <w:p>
+      <w:pPr>
+        <w:numPr>
+          <w:ilvl w:val="0"/>
+          <w:numId w:val="1015"/>
+        </w:numPr>
+        <w:pStyle w:val="Compact"/>
+      </w:pPr>
+      <w:r>
+        <w:rPr>
+          <w:bCs/>
+          <w:b/>
+        </w:rPr>
+        <w:t xml:space="preserve">Status:</w:t>
+      </w:r>
+      <w:r>
+        <w:t xml:space="preserve"> </w:t>
+      </w:r>
+      <w:r>
+        <w:t xml:space="preserve">Never filed statewide</w:t>
+      </w:r>
+    </w:p>
+    <w:p>
+      <w:pPr>
+        <w:numPr>
+          <w:ilvl w:val="0"/>
+          <w:numId w:val="1015"/>
+        </w:numPr>
+        <w:pStyle w:val="Compact"/>
+      </w:pPr>
+      <w:r>
+        <w:rPr>
+          <w:bCs/>
+          <w:b/>
+        </w:rPr>
+        <w:t xml:space="preserve">The record:</w:t>
+      </w:r>
+      <w:r>
+        <w:t xml:space="preserve"> </w:t>
+      </w:r>
+      <w:r>
+        <w:t xml:space="preserve">No bill has proposed a statewide metering mandate. Closest moves, all enacted: domestic wells in stressed basins can keep pumping 0.5 acre-feet only if the owner installs a meter (80:AB95, extended by 82:SB113); water suppliers must audit and report water losses (82:AB191); supplier conservation plans must address leaks (80:AB163).</w:t>
+      </w:r>
+    </w:p>
+    <w:p>
+      <w:pPr>
+        <w:numPr>
+          <w:ilvl w:val="0"/>
+          <w:numId w:val="1015"/>
+        </w:numPr>
+        <w:pStyle w:val="Compact"/>
+      </w:pPr>
+      <w:r>
+        <w:rPr>
+          <w:bCs/>
+          <w:b/>
+        </w:rPr>
+        <w:t xml:space="preserve">Where the decision sits:</w:t>
+      </w:r>
+      <w:r>
+        <w:t xml:space="preserve"> </w:t>
+      </w:r>
+      <w:r>
+        <w:t xml:space="preserve">Rate metering of homes and businesses is a utility/local decision today (citizens’ flat-rate complaint sits with cities and utilities); the legislature has only touched wells and supplier reporting.</w:t>
+      </w:r>
+    </w:p>
+    <w:tbl>
+      <w:tblPr>
+        <w:tblStyle w:val="Table"/>
+        <w:tblW w:type="pct" w:w="5000"/>
+        <w:tblLook w:firstRow="1" w:lastRow="0" w:firstColumn="0" w:lastColumn="0" w:noHBand="0" w:noVBand="0" w:val="0020"/>
+        <w:jc w:val="start"/>
+      </w:tblPr>
+      <w:tblGrid>
+        <w:gridCol w:w="1980"/>
+        <w:gridCol w:w="1980"/>
+        <w:gridCol w:w="1980"/>
+        <w:gridCol w:w="1980"/>
+      </w:tblGrid>
+      <w:tr>
+        <w:trPr>
+          <w:tblHeader w:val="true"/>
+        </w:trPr>
+        <w:tc>
+          <w:tcPr/>
+          <w:p>
+            <w:pPr>
+              <w:pStyle w:val="Compact"/>
+              <w:jc w:val="left"/>
+            </w:pPr>
+            <w:r>
+              <w:t xml:space="preserve">Bill</w:t>
+            </w:r>
+          </w:p>
+        </w:tc>
+        <w:tc>
+          <w:tcPr/>
+          <w:p>
+            <w:pPr>
+              <w:pStyle w:val="Compact"/>
+              <w:jc w:val="left"/>
+            </w:pPr>
+            <w:r>
+              <w:t xml:space="preserve">What it tried</w:t>
+            </w:r>
+          </w:p>
+        </w:tc>
+        <w:tc>
+          <w:tcPr/>
+          <w:p>
+            <w:pPr>
+              <w:pStyle w:val="Compact"/>
+              <w:jc w:val="left"/>
+            </w:pPr>
+            <w:r>
+              <w:t xml:space="preserve">Result</w:t>
+            </w:r>
+          </w:p>
+        </w:tc>
+        <w:tc>
+          <w:tcPr/>
+          <w:p>
+            <w:pPr>
+              <w:pStyle w:val="Compact"/>
+              <w:jc w:val="left"/>
+            </w:pPr>
+            <w:r>
+              <w:t xml:space="preserve">Where it ended</w:t>
+            </w:r>
+          </w:p>
+        </w:tc>
+      </w:tr>
+      <w:tr>
+        <w:tc>
+          <w:tcPr/>
+          <w:p>
+            <w:pPr>
+              <w:pStyle w:val="Compact"/>
+              <w:jc w:val="left"/>
+            </w:pPr>
+            <w:r>
+              <w:t xml:space="preserve">2019 AB95</w:t>
+            </w:r>
+          </w:p>
+        </w:tc>
+        <w:tc>
+          <w:tcPr/>
+          <w:p>
+            <w:pPr>
+              <w:pStyle w:val="Compact"/>
+              <w:jc w:val="left"/>
+            </w:pPr>
+            <w:r>
+              <w:t xml:space="preserve">Told the State Engineer how to study groundwater basins that may not refill fast enough</w:t>
+            </w:r>
+          </w:p>
+        </w:tc>
+        <w:tc>
+          <w:tcPr/>
+          <w:p>
+            <w:pPr>
+              <w:pStyle w:val="Compact"/>
+              <w:jc w:val="left"/>
+            </w:pPr>
+            <w:r>
+              <w:t xml:space="preserve">Enacted</w:t>
+            </w:r>
+          </w:p>
+        </w:tc>
+        <w:tc>
+          <w:tcPr/>
+          <w:p>
+            <w:pPr>
+              <w:pStyle w:val="Compact"/>
+              <w:jc w:val="left"/>
+            </w:pPr>
+            <w:r>
+              <w:t xml:space="preserve">Became law</w:t>
+            </w:r>
+          </w:p>
+        </w:tc>
+      </w:tr>
+      <w:tr>
+        <w:tc>
+          <w:tcPr/>
+          <w:p>
+            <w:pPr>
+              <w:pStyle w:val="Compact"/>
+              <w:jc w:val="left"/>
+            </w:pPr>
+            <w:r>
+              <w:t xml:space="preserve">2023 SB113</w:t>
+            </w:r>
+          </w:p>
+        </w:tc>
+        <w:tc>
+          <w:tcPr/>
+          <w:p>
+            <w:pPr>
+              <w:pStyle w:val="Compact"/>
+              <w:jc w:val="left"/>
+            </w:pPr>
+            <w:r>
+              <w:t xml:space="preserve">Changed how over-pumped groundwater areas get named</w:t>
+            </w:r>
+            <w:r>
+              <w:t xml:space="preserve"> </w:t>
+            </w:r>
+            <w:r>
+              <w:t xml:space="preserve">‘</w:t>
+            </w:r>
+            <w:r>
+              <w:t xml:space="preserve">critical management areas</w:t>
+            </w:r>
+            <w:r>
+              <w:t xml:space="preserve">’</w:t>
+            </w:r>
+          </w:p>
+        </w:tc>
+        <w:tc>
+          <w:tcPr/>
+          <w:p>
+            <w:pPr>
+              <w:pStyle w:val="Compact"/>
+              <w:jc w:val="left"/>
+            </w:pPr>
+            <w:r>
+              <w:t xml:space="preserve">Enacted</w:t>
+            </w:r>
+          </w:p>
+        </w:tc>
+        <w:tc>
+          <w:tcPr/>
+          <w:p>
+            <w:pPr>
+              <w:pStyle w:val="Compact"/>
+              <w:jc w:val="left"/>
+            </w:pPr>
+            <w:r>
+              <w:t xml:space="preserve">Became law</w:t>
+            </w:r>
+          </w:p>
+        </w:tc>
+      </w:tr>
+      <w:tr>
+        <w:tc>
+          <w:tcPr/>
+          <w:p>
+            <w:pPr>
+              <w:pStyle w:val="Compact"/>
+              <w:jc w:val="left"/>
+            </w:pPr>
+            <w:r>
+              <w:t xml:space="preserve">2023 AB191</w:t>
+            </w:r>
+          </w:p>
+        </w:tc>
+        <w:tc>
+          <w:tcPr/>
+          <w:p>
+            <w:pPr>
+              <w:pStyle w:val="Compact"/>
+              <w:jc w:val="left"/>
+            </w:pPr>
+            <w:r>
+              <w:t xml:space="preserve">Required water suppliers to audit and report their water losses</w:t>
+            </w:r>
+          </w:p>
+        </w:tc>
+        <w:tc>
+          <w:tcPr/>
+          <w:p>
+            <w:pPr>
+              <w:pStyle w:val="Compact"/>
+              <w:jc w:val="left"/>
+            </w:pPr>
+            <w:r>
+              <w:t xml:space="preserve">Enacted</w:t>
+            </w:r>
+          </w:p>
+        </w:tc>
+        <w:tc>
+          <w:tcPr/>
+          <w:p>
+            <w:pPr>
+              <w:pStyle w:val="Compact"/>
+              <w:jc w:val="left"/>
+            </w:pPr>
+            <w:r>
+              <w:t xml:space="preserve">Became law</w:t>
+            </w:r>
+          </w:p>
+        </w:tc>
+      </w:tr>
+      <w:tr>
+        <w:tc>
+          <w:tcPr/>
+          <w:p>
+            <w:pPr>
+              <w:pStyle w:val="Compact"/>
+              <w:jc w:val="left"/>
+            </w:pPr>
+            <w:r>
+              <w:t xml:space="preserve">2019 AB163</w:t>
+            </w:r>
+          </w:p>
+        </w:tc>
+        <w:tc>
+          <w:tcPr/>
+          <w:p>
+            <w:pPr>
+              <w:pStyle w:val="Compact"/>
+              <w:jc w:val="left"/>
+            </w:pPr>
+            <w:r>
+              <w:t xml:space="preserve">Updated the water-saving plans that water suppliers must write, adding leak checks</w:t>
+            </w:r>
+          </w:p>
+        </w:tc>
+        <w:tc>
+          <w:tcPr/>
+          <w:p>
+            <w:pPr>
+              <w:pStyle w:val="Compact"/>
+              <w:jc w:val="left"/>
+            </w:pPr>
+            <w:r>
+              <w:t xml:space="preserve">Enacted</w:t>
+            </w:r>
+          </w:p>
+        </w:tc>
+        <w:tc>
+          <w:tcPr/>
+          <w:p>
+            <w:pPr>
+              <w:pStyle w:val="Compact"/>
+              <w:jc w:val="left"/>
+            </w:pPr>
+            <w:r>
+              <w:t xml:space="preserve">Became law</w:t>
+            </w:r>
+          </w:p>
+        </w:tc>
+      </w:tr>
+    </w:tbl>
+    <w:p>
+      <w:pPr>
+        <w:pStyle w:val="BodyText"/>
+      </w:pPr>
+      <w:r>
+        <w:rPr>
+          <w:bCs/>
+          <w:b/>
+        </w:rPr>
+        <w:t xml:space="preserve">Open questions for a working group:</w:t>
+      </w:r>
+      <w:r>
+        <w:t xml:space="preserve"> </w:t>
+      </w:r>
+      <w:r>
+        <w:t xml:space="preserve">- Which flat-rate systems remain, and are they city, utility, or district decisions?</w:t>
+      </w:r>
+      <w:r>
+        <w:t xml:space="preserve"> </w:t>
+      </w:r>
+      <w:r>
+        <w:t xml:space="preserve">- Would a state mandate fund retrofits or just require them?</w:t>
+      </w:r>
+    </w:p>
+    <w:bookmarkEnd w:id="48"/>
+    <w:bookmarkStart w:id="49" w:name="X9a229b3fa45ecf22c492adfdb481c5f861fc451"/>
+    <w:p>
+      <w:pPr>
+        <w:pStyle w:val="Heading2"/>
+      </w:pPr>
+      <w:r>
+        <w:t xml:space="preserve">5. Stronger enforcement and steeper, escalating fines for water waste.</w:t>
+      </w:r>
+    </w:p>
+    <w:p>
+      <w:pPr>
+        <w:numPr>
+          <w:ilvl w:val="0"/>
+          <w:numId w:val="1016"/>
+        </w:numPr>
+        <w:pStyle w:val="Compact"/>
+      </w:pPr>
+      <w:r>
+        <w:rPr>
+          <w:bCs/>
+          <w:b/>
+        </w:rPr>
+        <w:t xml:space="preserve">Status:</w:t>
+      </w:r>
+      <w:r>
+        <w:t xml:space="preserve"> </w:t>
+      </w:r>
+      <w:r>
+        <w:t xml:space="preserve">Never filed</w:t>
+      </w:r>
+    </w:p>
+    <w:p>
+      <w:pPr>
+        <w:numPr>
+          <w:ilvl w:val="0"/>
+          <w:numId w:val="1016"/>
+        </w:numPr>
+        <w:pStyle w:val="Compact"/>
+      </w:pPr>
+      <w:r>
+        <w:rPr>
+          <w:bCs/>
+          <w:b/>
+        </w:rPr>
+        <w:t xml:space="preserve">The record:</w:t>
+      </w:r>
+      <w:r>
+        <w:t xml:space="preserve"> </w:t>
+      </w:r>
+      <w:r>
+        <w:t xml:space="preserve">No bill on water-waste fines. The nearest law: 80:AB537 (enacted) raised civil penalties for environmental violations - pollution and public-water-system laws, not lawn watering. Watering-day enforcement and waste fines are utility/city rules today.</w:t>
+      </w:r>
+    </w:p>
+    <w:p>
+      <w:pPr>
+        <w:numPr>
+          <w:ilvl w:val="0"/>
+          <w:numId w:val="1016"/>
+        </w:numPr>
+        <w:pStyle w:val="Compact"/>
+      </w:pPr>
+      <w:r>
+        <w:rPr>
+          <w:bCs/>
+          <w:b/>
+        </w:rPr>
+        <w:t xml:space="preserve">Where the decision sits:</w:t>
+      </w:r>
+      <w:r>
+        <w:t xml:space="preserve"> </w:t>
+      </w:r>
+      <w:r>
+        <w:t xml:space="preserve">Citizens’ own complaint - cities can’t afford water monitors - is a funding question the legislature has never taken up for water enforcement.</w:t>
+      </w:r>
+    </w:p>
+    <w:tbl>
+      <w:tblPr>
+        <w:tblStyle w:val="Table"/>
+        <w:tblW w:type="pct" w:w="5000"/>
+        <w:tblLook w:firstRow="1" w:lastRow="0" w:firstColumn="0" w:lastColumn="0" w:noHBand="0" w:noVBand="0" w:val="0020"/>
+        <w:jc w:val="start"/>
+      </w:tblPr>
+      <w:tblGrid>
+        <w:gridCol w:w="1980"/>
+        <w:gridCol w:w="1980"/>
+        <w:gridCol w:w="1980"/>
+        <w:gridCol w:w="1980"/>
+      </w:tblGrid>
+      <w:tr>
+        <w:trPr>
+          <w:tblHeader w:val="true"/>
+        </w:trPr>
+        <w:tc>
+          <w:tcPr/>
+          <w:p>
+            <w:pPr>
+              <w:pStyle w:val="Compact"/>
+              <w:jc w:val="left"/>
+            </w:pPr>
+            <w:r>
+              <w:t xml:space="preserve">Bill</w:t>
+            </w:r>
+          </w:p>
+        </w:tc>
+        <w:tc>
+          <w:tcPr/>
+          <w:p>
+            <w:pPr>
+              <w:pStyle w:val="Compact"/>
+              <w:jc w:val="left"/>
+            </w:pPr>
+            <w:r>
+              <w:t xml:space="preserve">What it tried</w:t>
+            </w:r>
+          </w:p>
+        </w:tc>
+        <w:tc>
+          <w:tcPr/>
+          <w:p>
+            <w:pPr>
+              <w:pStyle w:val="Compact"/>
+              <w:jc w:val="left"/>
+            </w:pPr>
+            <w:r>
+              <w:t xml:space="preserve">Result</w:t>
+            </w:r>
+          </w:p>
+        </w:tc>
+        <w:tc>
+          <w:tcPr/>
+          <w:p>
+            <w:pPr>
+              <w:pStyle w:val="Compact"/>
+              <w:jc w:val="left"/>
+            </w:pPr>
+            <w:r>
+              <w:t xml:space="preserve">Where it ended</w:t>
+            </w:r>
+          </w:p>
+        </w:tc>
+      </w:tr>
+      <w:tr>
+        <w:tc>
+          <w:tcPr/>
+          <w:p>
+            <w:pPr>
+              <w:pStyle w:val="Compact"/>
+              <w:jc w:val="left"/>
+            </w:pPr>
+            <w:r>
+              <w:t xml:space="preserve">2019 AB537</w:t>
+            </w:r>
+          </w:p>
+        </w:tc>
+        <w:tc>
+          <w:tcPr/>
+          <w:p>
+            <w:pPr>
+              <w:pStyle w:val="Compact"/>
+              <w:jc w:val="left"/>
+            </w:pPr>
+            <w:r>
+              <w:t xml:space="preserve">Raised penalties for breaking environmental laws, including water laws</w:t>
+            </w:r>
+          </w:p>
+        </w:tc>
+        <w:tc>
+          <w:tcPr/>
+          <w:p>
+            <w:pPr>
+              <w:pStyle w:val="Compact"/>
+              <w:jc w:val="left"/>
+            </w:pPr>
+            <w:r>
+              <w:t xml:space="preserve">Enacted</w:t>
+            </w:r>
+          </w:p>
+        </w:tc>
+        <w:tc>
+          <w:tcPr/>
+          <w:p>
+            <w:pPr>
+              <w:pStyle w:val="Compact"/>
+              <w:jc w:val="left"/>
+            </w:pPr>
+            <w:r>
+              <w:t xml:space="preserve">Became law</w:t>
+            </w:r>
+          </w:p>
+        </w:tc>
+      </w:tr>
+    </w:tbl>
+    <w:p>
+      <w:pPr>
+        <w:pStyle w:val="BodyText"/>
+      </w:pPr>
+      <w:r>
+        <w:rPr>
+          <w:bCs/>
+          <w:b/>
+        </w:rPr>
+        <w:t xml:space="preserve">Open questions for a working group:</w:t>
+      </w:r>
+      <w:r>
+        <w:t xml:space="preserve"> </w:t>
+      </w:r>
+      <w:r>
+        <w:t xml:space="preserve">- Are escalating fines a statute question or a utility-tariff question in each region?</w:t>
+      </w:r>
+      <w:r>
+        <w:t xml:space="preserve"> </w:t>
+      </w:r>
+      <w:r>
+        <w:t xml:space="preserve">- Who would fund enforcement staff?</w:t>
+      </w:r>
+    </w:p>
+    <w:bookmarkEnd w:id="49"/>
+    <w:bookmarkStart w:id="50" w:name="X2b19c1cd896596d237bca80bdb24db5fbf39c86"/>
+    <w:p>
+      <w:pPr>
+        <w:pStyle w:val="Heading2"/>
+      </w:pPr>
+      <w:r>
+        <w:t xml:space="preserve">6. Incentivize heavy and business users to adopt water-saving technology - money talks.</w:t>
+      </w:r>
+    </w:p>
+    <w:p>
+      <w:pPr>
+        <w:numPr>
+          <w:ilvl w:val="0"/>
+          <w:numId w:val="1017"/>
+        </w:numPr>
+        <w:pStyle w:val="Compact"/>
+      </w:pPr>
+      <w:r>
+        <w:rPr>
+          <w:bCs/>
+          <w:b/>
+        </w:rPr>
+        <w:t xml:space="preserve">Status:</w:t>
+      </w:r>
+      <w:r>
+        <w:t xml:space="preserve"> </w:t>
+      </w:r>
+      <w:r>
+        <w:t xml:space="preserve">Thin record</w:t>
+      </w:r>
+    </w:p>
+    <w:p>
+      <w:pPr>
+        <w:numPr>
+          <w:ilvl w:val="0"/>
+          <w:numId w:val="1017"/>
+        </w:numPr>
+        <w:pStyle w:val="Compact"/>
+      </w:pPr>
+      <w:r>
+        <w:rPr>
+          <w:bCs/>
+          <w:b/>
+        </w:rPr>
+        <w:t xml:space="preserve">The record:</w:t>
+      </w:r>
+      <w:r>
+        <w:t xml:space="preserve"> </w:t>
+      </w:r>
+      <w:r>
+        <w:t xml:space="preserve">No state incentive program for business water saving exists. Closest, both enacted: 81:SB283 let local improvement districts finance water-efficiency projects; 82:AB261 made the state economic development plan address efficient water use.</w:t>
+      </w:r>
+    </w:p>
+    <w:p>
+      <w:pPr>
+        <w:numPr>
+          <w:ilvl w:val="0"/>
+          <w:numId w:val="1017"/>
+        </w:numPr>
+        <w:pStyle w:val="Compact"/>
+      </w:pPr>
+      <w:r>
+        <w:rPr>
+          <w:bCs/>
+          <w:b/>
+        </w:rPr>
+        <w:t xml:space="preserve">Where the decision sits:</w:t>
+      </w:r>
+      <w:r>
+        <w:t xml:space="preserve"> </w:t>
+      </w:r>
+      <w:r>
+        <w:t xml:space="preserve">State-level lever exists (GOED programs, improvement districts); it has been used for energy far more than water.</w:t>
+      </w:r>
+    </w:p>
+    <w:tbl>
+      <w:tblPr>
+        <w:tblStyle w:val="Table"/>
+        <w:tblW w:type="pct" w:w="5000"/>
+        <w:tblLook w:firstRow="1" w:lastRow="0" w:firstColumn="0" w:lastColumn="0" w:noHBand="0" w:noVBand="0" w:val="0020"/>
+        <w:jc w:val="start"/>
+      </w:tblPr>
+      <w:tblGrid>
+        <w:gridCol w:w="1980"/>
+        <w:gridCol w:w="1980"/>
+        <w:gridCol w:w="1980"/>
+        <w:gridCol w:w="1980"/>
+      </w:tblGrid>
+      <w:tr>
+        <w:trPr>
+          <w:tblHeader w:val="true"/>
+        </w:trPr>
+        <w:tc>
+          <w:tcPr/>
+          <w:p>
+            <w:pPr>
+              <w:pStyle w:val="Compact"/>
+              <w:jc w:val="left"/>
+            </w:pPr>
+            <w:r>
+              <w:t xml:space="preserve">Bill</w:t>
+            </w:r>
+          </w:p>
+        </w:tc>
+        <w:tc>
+          <w:tcPr/>
+          <w:p>
+            <w:pPr>
+              <w:pStyle w:val="Compact"/>
+              <w:jc w:val="left"/>
+            </w:pPr>
+            <w:r>
+              <w:t xml:space="preserve">What it tried</w:t>
+            </w:r>
+          </w:p>
+        </w:tc>
+        <w:tc>
+          <w:tcPr/>
+          <w:p>
+            <w:pPr>
+              <w:pStyle w:val="Compact"/>
+              <w:jc w:val="left"/>
+            </w:pPr>
+            <w:r>
+              <w:t xml:space="preserve">Result</w:t>
+            </w:r>
+          </w:p>
+        </w:tc>
+        <w:tc>
+          <w:tcPr/>
+          <w:p>
+            <w:pPr>
+              <w:pStyle w:val="Compact"/>
+              <w:jc w:val="left"/>
+            </w:pPr>
+            <w:r>
+              <w:t xml:space="preserve">Where it ended</w:t>
+            </w:r>
+          </w:p>
+        </w:tc>
+      </w:tr>
+      <w:tr>
+        <w:tc>
+          <w:tcPr/>
+          <w:p>
+            <w:pPr>
+              <w:pStyle w:val="Compact"/>
+              <w:jc w:val="left"/>
+            </w:pPr>
+            <w:r>
+              <w:t xml:space="preserve">2021 SB283</w:t>
+            </w:r>
+          </w:p>
+        </w:tc>
+        <w:tc>
+          <w:tcPr/>
+          <w:p>
+            <w:pPr>
+              <w:pStyle w:val="Compact"/>
+              <w:jc w:val="left"/>
+            </w:pPr>
+            <w:r>
+              <w:t xml:space="preserve">Let local improvement financing cover water efficiency projects</w:t>
+            </w:r>
+          </w:p>
+        </w:tc>
+        <w:tc>
+          <w:tcPr/>
+          <w:p>
+            <w:pPr>
+              <w:pStyle w:val="Compact"/>
+              <w:jc w:val="left"/>
+            </w:pPr>
+            <w:r>
+              <w:t xml:space="preserve">Enacted</w:t>
+            </w:r>
+          </w:p>
+        </w:tc>
+        <w:tc>
+          <w:tcPr/>
+          <w:p>
+            <w:pPr>
+              <w:pStyle w:val="Compact"/>
+              <w:jc w:val="left"/>
+            </w:pPr>
+            <w:r>
+              <w:t xml:space="preserve">Became law</w:t>
+            </w:r>
+          </w:p>
+        </w:tc>
+      </w:tr>
+      <w:tr>
+        <w:tc>
+          <w:tcPr/>
+          <w:p>
+            <w:pPr>
+              <w:pStyle w:val="Compact"/>
+              <w:jc w:val="left"/>
+            </w:pPr>
+            <w:r>
+              <w:t xml:space="preserve">2023 AB261</w:t>
+            </w:r>
+          </w:p>
+        </w:tc>
+        <w:tc>
+          <w:tcPr/>
+          <w:p>
+            <w:pPr>
+              <w:pStyle w:val="Compact"/>
+              <w:jc w:val="left"/>
+            </w:pPr>
+            <w:r>
+              <w:t xml:space="preserve">Made the state economic development plan address efficient use of water</w:t>
+            </w:r>
+          </w:p>
+        </w:tc>
+        <w:tc>
+          <w:tcPr/>
+          <w:p>
+            <w:pPr>
+              <w:pStyle w:val="Compact"/>
+              <w:jc w:val="left"/>
+            </w:pPr>
+            <w:r>
+              <w:t xml:space="preserve">Enacted</w:t>
+            </w:r>
+          </w:p>
+        </w:tc>
+        <w:tc>
+          <w:tcPr/>
+          <w:p>
+            <w:pPr>
+              <w:pStyle w:val="Compact"/>
+              <w:jc w:val="left"/>
+            </w:pPr>
+            <w:r>
+              <w:t xml:space="preserve">Became law</w:t>
+            </w:r>
+          </w:p>
+        </w:tc>
+      </w:tr>
+    </w:tbl>
+    <w:p>
+      <w:pPr>
+        <w:pStyle w:val="BodyText"/>
+      </w:pPr>
+      <w:r>
+        <w:rPr>
+          <w:bCs/>
+          <w:b/>
+        </w:rPr>
+        <w:t xml:space="preserve">Open questions for a working group:</w:t>
+      </w:r>
+      <w:r>
+        <w:t xml:space="preserve"> </w:t>
+      </w:r>
+      <w:r>
+        <w:t xml:space="preserve">- Would an incentive tier ride on existing GOED machinery or need a new program?</w:t>
+      </w:r>
+      <w:r>
+        <w:t xml:space="preserve"> </w:t>
+      </w:r>
+      <w:r>
+        <w:t xml:space="preserve">- What did SB283 districts actually finance so far?</w:t>
+      </w:r>
+    </w:p>
+    <w:bookmarkEnd w:id="50"/>
+    <w:bookmarkStart w:id="51" w:name="X65b9fc0e97afd10430bf8251269c3eb42758fd7"/>
+    <w:p>
+      <w:pPr>
+        <w:pStyle w:val="Heading2"/>
+      </w:pPr>
+      <w:r>
+        <w:t xml:space="preserve">7. Attach public-benefit conditions to tax incentives, paid as reimbursement at the end once metrics are hit - today companies get the keys up front.</w:t>
+      </w:r>
+    </w:p>
+    <w:p>
+      <w:pPr>
+        <w:numPr>
+          <w:ilvl w:val="0"/>
+          <w:numId w:val="1018"/>
+        </w:numPr>
+        <w:pStyle w:val="Compact"/>
+      </w:pPr>
+      <w:r>
+        <w:rPr>
+          <w:bCs/>
+          <w:b/>
+        </w:rPr>
+        <w:t xml:space="preserve">Status:</w:t>
+      </w:r>
+      <w:r>
+        <w:t xml:space="preserve"> </w:t>
+      </w:r>
+      <w:r>
+        <w:t xml:space="preserve">This direction failed repeatedly</w:t>
+      </w:r>
+    </w:p>
+    <w:p>
+      <w:pPr>
+        <w:numPr>
+          <w:ilvl w:val="0"/>
+          <w:numId w:val="1018"/>
+        </w:numPr>
+        <w:pStyle w:val="Compact"/>
+      </w:pPr>
+      <w:r>
+        <w:rPr>
+          <w:bCs/>
+          <w:b/>
+        </w:rPr>
+        <w:t xml:space="preserve">The record:</w:t>
+      </w:r>
+      <w:r>
+        <w:t xml:space="preserve"> </w:t>
+      </w:r>
+      <w:r>
+        <w:t xml:space="preserve">The reimbursement-at-the-end design has never been filed. Every attempt to condition or cap the existing up-front abatements failed: 83:AB77 (grounds to deny; first committee), 82:SB394 (cap at $500k; passed Senate 14-7, died in Assembly Revenue), 82:SB429 (family-leave condition; vetoed), 81:AB449 (tighten agreements; first committee), 83:SB364 (stalled).</w:t>
+      </w:r>
+    </w:p>
+    <w:p>
+      <w:pPr>
+        <w:numPr>
+          <w:ilvl w:val="0"/>
+          <w:numId w:val="1018"/>
+        </w:numPr>
+        <w:pStyle w:val="Compact"/>
+      </w:pPr>
+      <w:r>
+        <w:rPr>
+          <w:bCs/>
+          <w:b/>
+        </w:rPr>
+        <w:t xml:space="preserve">Where the decision sits:</w:t>
+      </w:r>
+      <w:r>
+        <w:t xml:space="preserve"> </w:t>
+      </w:r>
+      <w:r>
+        <w:t xml:space="preserve">Pure state lever (NRS 274/360/701A abatements). The vetoed bill shows the governor’s desk is part of the path, not just the committees.</w:t>
+      </w:r>
+    </w:p>
+    <w:tbl>
+      <w:tblPr>
+        <w:tblStyle w:val="Table"/>
+        <w:tblW w:type="pct" w:w="5000"/>
+        <w:tblLook w:firstRow="1" w:lastRow="0" w:firstColumn="0" w:lastColumn="0" w:noHBand="0" w:noVBand="0" w:val="0020"/>
+        <w:jc w:val="start"/>
+      </w:tblPr>
+      <w:tblGrid>
+        <w:gridCol w:w="1980"/>
+        <w:gridCol w:w="1980"/>
+        <w:gridCol w:w="1980"/>
+        <w:gridCol w:w="1980"/>
+      </w:tblGrid>
+      <w:tr>
+        <w:trPr>
+          <w:tblHeader w:val="true"/>
+        </w:trPr>
+        <w:tc>
+          <w:tcPr/>
+          <w:p>
+            <w:pPr>
+              <w:pStyle w:val="Compact"/>
+              <w:jc w:val="left"/>
+            </w:pPr>
+            <w:r>
+              <w:t xml:space="preserve">Bill</w:t>
+            </w:r>
+          </w:p>
+        </w:tc>
+        <w:tc>
+          <w:tcPr/>
+          <w:p>
+            <w:pPr>
+              <w:pStyle w:val="Compact"/>
+              <w:jc w:val="left"/>
+            </w:pPr>
+            <w:r>
+              <w:t xml:space="preserve">What it tried</w:t>
+            </w:r>
+          </w:p>
+        </w:tc>
+        <w:tc>
+          <w:tcPr/>
+          <w:p>
+            <w:pPr>
+              <w:pStyle w:val="Compact"/>
+              <w:jc w:val="left"/>
+            </w:pPr>
+            <w:r>
+              <w:t xml:space="preserve">Result</w:t>
+            </w:r>
+          </w:p>
+        </w:tc>
+        <w:tc>
+          <w:tcPr/>
+          <w:p>
+            <w:pPr>
+              <w:pStyle w:val="Compact"/>
+              <w:jc w:val="left"/>
+            </w:pPr>
+            <w:r>
+              <w:t xml:space="preserve">Where it ended</w:t>
+            </w:r>
+          </w:p>
+        </w:tc>
+      </w:tr>
+      <w:tr>
+        <w:tc>
+          <w:tcPr/>
+          <w:p>
+            <w:pPr>
+              <w:pStyle w:val="Compact"/>
+              <w:jc w:val="left"/>
+            </w:pPr>
+            <w:r>
+              <w:t xml:space="preserve">2025 AB77</w:t>
+            </w:r>
+          </w:p>
+        </w:tc>
+        <w:tc>
+          <w:tcPr/>
+          <w:p>
+            <w:pPr>
+              <w:pStyle w:val="Compact"/>
+              <w:jc w:val="left"/>
+            </w:pPr>
+            <w:r>
+              <w:t xml:space="preserve">Would have added grounds to deny business tax breaks, with data centers named — died in first committee</w:t>
+            </w:r>
+          </w:p>
+        </w:tc>
+        <w:tc>
+          <w:tcPr/>
+          <w:p>
+            <w:pPr>
+              <w:pStyle w:val="Compact"/>
+              <w:jc w:val="left"/>
+            </w:pPr>
+            <w:r>
+              <w:t xml:space="preserve">Failed</w:t>
+            </w:r>
+          </w:p>
+        </w:tc>
+        <w:tc>
+          <w:tcPr/>
+          <w:p>
+            <w:pPr>
+              <w:pStyle w:val="Compact"/>
+              <w:jc w:val="left"/>
+            </w:pPr>
+            <w:r>
+              <w:t xml:space="preserve">Died in its first committee</w:t>
+            </w:r>
+          </w:p>
+        </w:tc>
+      </w:tr>
+      <w:tr>
+        <w:tc>
+          <w:tcPr/>
+          <w:p>
+            <w:pPr>
+              <w:pStyle w:val="Compact"/>
+              <w:jc w:val="left"/>
+            </w:pPr>
+            <w:r>
+              <w:t xml:space="preserve">2023 SB394</w:t>
+            </w:r>
+          </w:p>
+        </w:tc>
+        <w:tc>
+          <w:tcPr/>
+          <w:p>
+            <w:pPr>
+              <w:pStyle w:val="Compact"/>
+              <w:jc w:val="left"/>
+            </w:pPr>
+            <w:r>
+              <w:t xml:space="preserve">Would have capped big business tax breaks (data-center statutes included) at $500,000 — passed the Senate 14-7, died in the Assembly</w:t>
+            </w:r>
+          </w:p>
+        </w:tc>
+        <w:tc>
+          <w:tcPr/>
+          <w:p>
+            <w:pPr>
+              <w:pStyle w:val="Compact"/>
+              <w:jc w:val="left"/>
+            </w:pPr>
+            <w:r>
+              <w:t xml:space="preserve">Failed</w:t>
+            </w:r>
+          </w:p>
+        </w:tc>
+        <w:tc>
+          <w:tcPr/>
+          <w:p>
+            <w:pPr>
+              <w:pStyle w:val="Compact"/>
+              <w:jc w:val="left"/>
+            </w:pPr>
+            <w:r>
+              <w:t xml:space="preserve">Died in the second house</w:t>
+            </w:r>
+          </w:p>
+        </w:tc>
+      </w:tr>
+      <w:tr>
+        <w:tc>
+          <w:tcPr/>
+          <w:p>
+            <w:pPr>
+              <w:pStyle w:val="Compact"/>
+              <w:jc w:val="left"/>
+            </w:pPr>
+            <w:r>
+              <w:t xml:space="preserve">2023 SB429</w:t>
+            </w:r>
+          </w:p>
+        </w:tc>
+        <w:tc>
+          <w:tcPr/>
+          <w:p>
+            <w:pPr>
+              <w:pStyle w:val="Compact"/>
+              <w:jc w:val="left"/>
+            </w:pPr>
+            <w:r>
+              <w:t xml:space="preserve">Would have tied big tax breaks to paid family leave — vetoed</w:t>
+            </w:r>
+          </w:p>
+        </w:tc>
+        <w:tc>
+          <w:tcPr/>
+          <w:p>
+            <w:pPr>
+              <w:pStyle w:val="Compact"/>
+              <w:jc w:val="left"/>
+            </w:pPr>
+            <w:r>
+              <w:t xml:space="preserve">Vetoed</w:t>
+            </w:r>
+          </w:p>
+        </w:tc>
+        <w:tc>
+          <w:tcPr/>
+          <w:p>
+            <w:pPr>
+              <w:pStyle w:val="Compact"/>
+              <w:jc w:val="left"/>
+            </w:pPr>
+            <w:r>
+              <w:t xml:space="preserve">Vetoed by the governor</w:t>
+            </w:r>
+          </w:p>
+        </w:tc>
+      </w:tr>
+      <w:tr>
+        <w:tc>
+          <w:tcPr/>
+          <w:p>
+            <w:pPr>
+              <w:pStyle w:val="Compact"/>
+              <w:jc w:val="left"/>
+            </w:pPr>
+            <w:r>
+              <w:t xml:space="preserve">2021 AB449</w:t>
+            </w:r>
+          </w:p>
+        </w:tc>
+        <w:tc>
+          <w:tcPr/>
+          <w:p>
+            <w:pPr>
+              <w:pStyle w:val="Compact"/>
+              <w:jc w:val="left"/>
+            </w:pPr>
+            <w:r>
+              <w:t xml:space="preserve">Would have tightened the agreements businesses sign to get big tax breaks (data-center statutes included)</w:t>
+            </w:r>
+          </w:p>
+        </w:tc>
+        <w:tc>
+          <w:tcPr/>
+          <w:p>
+            <w:pPr>
+              <w:pStyle w:val="Compact"/>
+              <w:jc w:val="left"/>
+            </w:pPr>
+            <w:r>
+              <w:t xml:space="preserve">Failed</w:t>
+            </w:r>
+          </w:p>
+        </w:tc>
+        <w:tc>
+          <w:tcPr/>
+          <w:p>
+            <w:pPr>
+              <w:pStyle w:val="Compact"/>
+              <w:jc w:val="left"/>
+            </w:pPr>
+            <w:r>
+              <w:t xml:space="preserve">Died in its first committee</w:t>
+            </w:r>
+          </w:p>
+        </w:tc>
+      </w:tr>
+      <w:tr>
+        <w:tc>
+          <w:tcPr/>
+          <w:p>
+            <w:pPr>
+              <w:pStyle w:val="Compact"/>
+              <w:jc w:val="left"/>
+            </w:pPr>
+            <w:r>
+              <w:t xml:space="preserve">2025 SB364</w:t>
+            </w:r>
+          </w:p>
+        </w:tc>
+        <w:tc>
+          <w:tcPr/>
+          <w:p>
+            <w:pPr>
+              <w:pStyle w:val="Compact"/>
+              <w:jc w:val="left"/>
+            </w:pPr>
+            <w:r>
+              <w:t xml:space="preserve">Would have expanded business tax breaks (data-center statutes included)</w:t>
+            </w:r>
+          </w:p>
+        </w:tc>
+        <w:tc>
+          <w:tcPr/>
+          <w:p>
+            <w:pPr>
+              <w:pStyle w:val="Compact"/>
+              <w:jc w:val="left"/>
+            </w:pPr>
+            <w:r>
+              <w:t xml:space="preserve">Failed</w:t>
+            </w:r>
+          </w:p>
+        </w:tc>
+        <w:tc>
+          <w:tcPr/>
+          <w:p>
+            <w:pPr>
+              <w:pStyle w:val="Compact"/>
+              <w:jc w:val="left"/>
+            </w:pPr>
+            <w:r>
+              <w:t xml:space="preserve">Died on its first floor / calendar</w:t>
+            </w:r>
+          </w:p>
+        </w:tc>
+      </w:tr>
+    </w:tbl>
+    <w:p>
+      <w:pPr>
+        <w:pStyle w:val="BodyText"/>
+      </w:pPr>
+      <w:r>
+        <w:rPr>
+          <w:bCs/>
+          <w:b/>
+        </w:rPr>
+        <w:t xml:space="preserve">Open questions for a working group:</w:t>
+      </w:r>
+      <w:r>
+        <w:t xml:space="preserve"> </w:t>
+      </w:r>
+      <w:r>
+        <w:t xml:space="preserve">- SB394 passed the Senate before dying - is the blocker the idea or Assembly Revenue?</w:t>
+      </w:r>
+      <w:r>
+        <w:t xml:space="preserve"> </w:t>
+      </w:r>
+      <w:r>
+        <w:t xml:space="preserve">- Is a reimbursement design different enough to change the coalition?</w:t>
+      </w:r>
+    </w:p>
+    <w:bookmarkEnd w:id="51"/>
+    <w:bookmarkStart w:id="52" w:name="X87a25c6dd10572e47cdb8bdc9040deb8bfdc5c7"/>
+    <w:p>
+      <w:pPr>
+        <w:pStyle w:val="Heading2"/>
+      </w:pPr>
+      <w:r>
+        <w:t xml:space="preserve">8. Restrictions on new and existing growth - watering days, decorative-lawn bans, moratoriums; limits may have to get more severe.</w:t>
+      </w:r>
+    </w:p>
+    <w:p>
+      <w:pPr>
+        <w:numPr>
+          <w:ilvl w:val="0"/>
+          <w:numId w:val="1019"/>
+        </w:numPr>
+        <w:pStyle w:val="Compact"/>
+      </w:pPr>
+      <w:r>
+        <w:rPr>
+          <w:bCs/>
+          <w:b/>
+        </w:rPr>
+        <w:t xml:space="preserve">Status:</w:t>
+      </w:r>
+      <w:r>
+        <w:t xml:space="preserve"> </w:t>
+      </w:r>
+      <w:r>
+        <w:t xml:space="preserve">Precedent exists; mixed since</w:t>
+      </w:r>
+    </w:p>
+    <w:p>
+      <w:pPr>
+        <w:numPr>
+          <w:ilvl w:val="0"/>
+          <w:numId w:val="1019"/>
+        </w:numPr>
+        <w:pStyle w:val="Compact"/>
+      </w:pPr>
+      <w:r>
+        <w:rPr>
+          <w:bCs/>
+          <w:b/>
+        </w:rPr>
+        <w:t xml:space="preserve">The record:</w:t>
+      </w:r>
+      <w:r>
+        <w:t xml:space="preserve"> </w:t>
+      </w:r>
+      <w:r>
+        <w:t xml:space="preserve">The strongest precedent in the record: 81:AB356 banned decorative Colorado River grass in southern Nevada, 21-0 and 42-0. But the follow-ons stalled: 82:SB169 (conservation/climate in local master plans) was vetoed; 83:SB143 (turf study) died in the Assembly. The SNWA evaporative-cooling moratorium is a local rule, not a statute. Land-split water dedication (80:SB250) passed 39-0.</w:t>
+      </w:r>
+    </w:p>
+    <w:p>
+      <w:pPr>
+        <w:numPr>
+          <w:ilvl w:val="0"/>
+          <w:numId w:val="1019"/>
+        </w:numPr>
+        <w:pStyle w:val="Compact"/>
+      </w:pPr>
+      <w:r>
+        <w:rPr>
+          <w:bCs/>
+          <w:b/>
+        </w:rPr>
+        <w:t xml:space="preserve">Where the decision sits:</w:t>
+      </w:r>
+      <w:r>
+        <w:t xml:space="preserve"> </w:t>
+      </w:r>
+      <w:r>
+        <w:t xml:space="preserve">Split lever: the legislature acted on grass; watering days and moratoriums have stayed local so far.</w:t>
+      </w:r>
+    </w:p>
+    <w:tbl>
+      <w:tblPr>
+        <w:tblStyle w:val="Table"/>
+        <w:tblW w:type="pct" w:w="5000"/>
+        <w:tblLook w:firstRow="1" w:lastRow="0" w:firstColumn="0" w:lastColumn="0" w:noHBand="0" w:noVBand="0" w:val="0020"/>
+        <w:jc w:val="start"/>
+      </w:tblPr>
+      <w:tblGrid>
+        <w:gridCol w:w="1980"/>
+        <w:gridCol w:w="1980"/>
+        <w:gridCol w:w="1980"/>
+        <w:gridCol w:w="1980"/>
+      </w:tblGrid>
+      <w:tr>
+        <w:trPr>
+          <w:tblHeader w:val="true"/>
+        </w:trPr>
+        <w:tc>
+          <w:tcPr/>
+          <w:p>
+            <w:pPr>
+              <w:pStyle w:val="Compact"/>
+              <w:jc w:val="left"/>
+            </w:pPr>
+            <w:r>
+              <w:t xml:space="preserve">Bill</w:t>
+            </w:r>
+          </w:p>
+        </w:tc>
+        <w:tc>
+          <w:tcPr/>
+          <w:p>
+            <w:pPr>
+              <w:pStyle w:val="Compact"/>
+              <w:jc w:val="left"/>
+            </w:pPr>
+            <w:r>
+              <w:t xml:space="preserve">What it tried</w:t>
+            </w:r>
+          </w:p>
+        </w:tc>
+        <w:tc>
+          <w:tcPr/>
+          <w:p>
+            <w:pPr>
+              <w:pStyle w:val="Compact"/>
+              <w:jc w:val="left"/>
+            </w:pPr>
+            <w:r>
+              <w:t xml:space="preserve">Result</w:t>
+            </w:r>
+          </w:p>
+        </w:tc>
+        <w:tc>
+          <w:tcPr/>
+          <w:p>
+            <w:pPr>
+              <w:pStyle w:val="Compact"/>
+              <w:jc w:val="left"/>
+            </w:pPr>
+            <w:r>
+              <w:t xml:space="preserve">Where it ended</w:t>
+            </w:r>
+          </w:p>
+        </w:tc>
+      </w:tr>
+      <w:tr>
+        <w:tc>
+          <w:tcPr/>
+          <w:p>
+            <w:pPr>
+              <w:pStyle w:val="Compact"/>
+              <w:jc w:val="left"/>
+            </w:pPr>
+            <w:r>
+              <w:t xml:space="preserve">2021 AB356</w:t>
+            </w:r>
+          </w:p>
+        </w:tc>
+        <w:tc>
+          <w:tcPr/>
+          <w:p>
+            <w:pPr>
+              <w:pStyle w:val="Compact"/>
+              <w:jc w:val="left"/>
+            </w:pPr>
+            <w:r>
+              <w:t xml:space="preserve">Banned decorative grass that uses Colorado River water in southern Nevada</w:t>
+            </w:r>
+          </w:p>
+        </w:tc>
+        <w:tc>
+          <w:tcPr/>
+          <w:p>
+            <w:pPr>
+              <w:pStyle w:val="Compact"/>
+              <w:jc w:val="left"/>
+            </w:pPr>
+            <w:r>
+              <w:t xml:space="preserve">Enacted</w:t>
+            </w:r>
+          </w:p>
+        </w:tc>
+        <w:tc>
+          <w:tcPr/>
+          <w:p>
+            <w:pPr>
+              <w:pStyle w:val="Compact"/>
+              <w:jc w:val="left"/>
+            </w:pPr>
+            <w:r>
+              <w:t xml:space="preserve">Became law</w:t>
+            </w:r>
+          </w:p>
+        </w:tc>
+      </w:tr>
+      <w:tr>
+        <w:tc>
+          <w:tcPr/>
+          <w:p>
+            <w:pPr>
+              <w:pStyle w:val="Compact"/>
+              <w:jc w:val="left"/>
+            </w:pPr>
+            <w:r>
+              <w:t xml:space="preserve">2023 SB169</w:t>
+            </w:r>
+          </w:p>
+        </w:tc>
+        <w:tc>
+          <w:tcPr/>
+          <w:p>
+            <w:pPr>
+              <w:pStyle w:val="Compact"/>
+              <w:jc w:val="left"/>
+            </w:pPr>
+            <w:r>
+              <w:t xml:space="preserve">Would have added conservation and climate items to local master plans — vetoed</w:t>
+            </w:r>
+          </w:p>
+        </w:tc>
+        <w:tc>
+          <w:tcPr/>
+          <w:p>
+            <w:pPr>
+              <w:pStyle w:val="Compact"/>
+              <w:jc w:val="left"/>
+            </w:pPr>
+            <w:r>
+              <w:t xml:space="preserve">Vetoed</w:t>
+            </w:r>
+          </w:p>
+        </w:tc>
+        <w:tc>
+          <w:tcPr/>
+          <w:p>
+            <w:pPr>
+              <w:pStyle w:val="Compact"/>
+              <w:jc w:val="left"/>
+            </w:pPr>
+            <w:r>
+              <w:t xml:space="preserve">Vetoed by the governor</w:t>
+            </w:r>
+          </w:p>
+        </w:tc>
+      </w:tr>
+      <w:tr>
+        <w:tc>
+          <w:tcPr/>
+          <w:p>
+            <w:pPr>
+              <w:pStyle w:val="Compact"/>
+              <w:jc w:val="left"/>
+            </w:pPr>
+            <w:r>
+              <w:t xml:space="preserve">2025 SB143</w:t>
+            </w:r>
+          </w:p>
+        </w:tc>
+        <w:tc>
+          <w:tcPr/>
+          <w:p>
+            <w:pPr>
+              <w:pStyle w:val="Compact"/>
+              <w:jc w:val="left"/>
+            </w:pPr>
+            <w:r>
+              <w:t xml:space="preserve">Planned a review of water saving, plus a fake-grass study — passed the Senate 21-0, died in the Assembly</w:t>
+            </w:r>
+          </w:p>
+        </w:tc>
+        <w:tc>
+          <w:tcPr/>
+          <w:p>
+            <w:pPr>
+              <w:pStyle w:val="Compact"/>
+              <w:jc w:val="left"/>
+            </w:pPr>
+            <w:r>
+              <w:t xml:space="preserve">Failed</w:t>
+            </w:r>
+          </w:p>
+        </w:tc>
+        <w:tc>
+          <w:tcPr/>
+          <w:p>
+            <w:pPr>
+              <w:pStyle w:val="Compact"/>
+              <w:jc w:val="left"/>
+            </w:pPr>
+            <w:r>
+              <w:t xml:space="preserve">Died in the second house</w:t>
+            </w:r>
+          </w:p>
+        </w:tc>
+      </w:tr>
+      <w:tr>
+        <w:tc>
+          <w:tcPr/>
+          <w:p>
+            <w:pPr>
+              <w:pStyle w:val="Compact"/>
+              <w:jc w:val="left"/>
+            </w:pPr>
+            <w:r>
+              <w:t xml:space="preserve">2019 SB250</w:t>
+            </w:r>
+          </w:p>
+        </w:tc>
+        <w:tc>
+          <w:tcPr/>
+          <w:p>
+            <w:pPr>
+              <w:pStyle w:val="Compact"/>
+              <w:jc w:val="left"/>
+            </w:pPr>
+            <w:r>
+              <w:t xml:space="preserve">Rules on dedicating water rights before land can be split into parcels</w:t>
+            </w:r>
+          </w:p>
+        </w:tc>
+        <w:tc>
+          <w:tcPr/>
+          <w:p>
+            <w:pPr>
+              <w:pStyle w:val="Compact"/>
+              <w:jc w:val="left"/>
+            </w:pPr>
+            <w:r>
+              <w:t xml:space="preserve">Enacted</w:t>
+            </w:r>
+          </w:p>
+        </w:tc>
+        <w:tc>
+          <w:tcPr/>
+          <w:p>
+            <w:pPr>
+              <w:pStyle w:val="Compact"/>
+              <w:jc w:val="left"/>
+            </w:pPr>
+            <w:r>
+              <w:t xml:space="preserve">Became law</w:t>
+            </w:r>
+          </w:p>
+        </w:tc>
+      </w:tr>
+    </w:tbl>
+    <w:p>
+      <w:pPr>
+        <w:pStyle w:val="BodyText"/>
+      </w:pPr>
+      <w:r>
+        <w:rPr>
+          <w:bCs/>
+          <w:b/>
+        </w:rPr>
+        <w:t xml:space="preserve">Open questions for a working group:</w:t>
+      </w:r>
+      <w:r>
+        <w:t xml:space="preserve"> </w:t>
+      </w:r>
+      <w:r>
+        <w:t xml:space="preserve">- AB356 applied only to the Colorado River service area - is a statewide version a fairness fix or a new regional fight?</w:t>
+      </w:r>
+      <w:r>
+        <w:t xml:space="preserve"> </w:t>
+      </w:r>
+      <w:r>
+        <w:t xml:space="preserve">- What did the 2023 veto signal for planning mandates?</w:t>
+      </w:r>
+    </w:p>
+    <w:bookmarkEnd w:id="52"/>
+    <w:bookmarkStart w:id="53" w:name="X43b84bcbd658fa8f615af7b36c83fde26b0b6fc"/>
+    <w:p>
+      <w:pPr>
+        <w:pStyle w:val="Heading2"/>
+      </w:pPr>
+      <w:r>
+        <w:t xml:space="preserve">9. Fairness across users and regions - no carve-outs, water doesn’t stop at county lines, be scientific about it.</w:t>
+      </w:r>
+    </w:p>
+    <w:p>
+      <w:pPr>
+        <w:numPr>
+          <w:ilvl w:val="0"/>
+          <w:numId w:val="1020"/>
+        </w:numPr>
+        <w:pStyle w:val="Compact"/>
+      </w:pPr>
+      <w:r>
+        <w:rPr>
+          <w:bCs/>
+          <w:b/>
+        </w:rPr>
+        <w:t xml:space="preserve">Status:</w:t>
+      </w:r>
+      <w:r>
+        <w:t xml:space="preserve"> </w:t>
+      </w:r>
+      <w:r>
+        <w:t xml:space="preserve">Tried, but stalled</w:t>
+      </w:r>
+    </w:p>
+    <w:p>
+      <w:pPr>
+        <w:numPr>
+          <w:ilvl w:val="0"/>
+          <w:numId w:val="1020"/>
+        </w:numPr>
+        <w:pStyle w:val="Compact"/>
+      </w:pPr>
+      <w:r>
+        <w:rPr>
+          <w:bCs/>
+          <w:b/>
+        </w:rPr>
+        <w:t xml:space="preserve">The record:</w:t>
+      </w:r>
+      <w:r>
+        <w:t xml:space="preserve"> </w:t>
+      </w:r>
+      <w:r>
+        <w:t xml:space="preserve">The two bills closest to</w:t>
+      </w:r>
+      <w:r>
+        <w:t xml:space="preserve"> </w:t>
+      </w:r>
+      <w:r>
+        <w:t xml:space="preserve">‘</w:t>
+      </w:r>
+      <w:r>
+        <w:t xml:space="preserve">treat water as one statewide, scientific resource</w:t>
+      </w:r>
+      <w:r>
+        <w:t xml:space="preserve">’</w:t>
+      </w:r>
+      <w:r>
+        <w:t xml:space="preserve"> </w:t>
+      </w:r>
+      <w:r>
+        <w:t xml:space="preserve">both failed: 80:AB51 (State Engineer rules to manage all water sources together) died in first committee; 82:AB387 (best available science mandate) passed the Assembly 26-14 and died in the Senate. Meanwhile the enacted record is regional by design: the grass ban covers only southern Nevada; northern and southern dedication rules differ.</w:t>
+      </w:r>
+    </w:p>
+    <w:p>
+      <w:pPr>
+        <w:numPr>
+          <w:ilvl w:val="0"/>
+          <w:numId w:val="1020"/>
+        </w:numPr>
+        <w:pStyle w:val="Compact"/>
+      </w:pPr>
+      <w:r>
+        <w:rPr>
+          <w:bCs/>
+          <w:b/>
+        </w:rPr>
+        <w:t xml:space="preserve">Where the decision sits:</w:t>
+      </w:r>
+      <w:r>
+        <w:t xml:space="preserve"> </w:t>
+      </w:r>
+      <w:r>
+        <w:t xml:space="preserve">The tension citizens named - my-county-first voting - is visible in the record as repeated committee deaths for statewide-standard bills.</w:t>
+      </w:r>
+    </w:p>
+    <w:tbl>
+      <w:tblPr>
+        <w:tblStyle w:val="Table"/>
+        <w:tblW w:type="pct" w:w="5000"/>
+        <w:tblLook w:firstRow="1" w:lastRow="0" w:firstColumn="0" w:lastColumn="0" w:noHBand="0" w:noVBand="0" w:val="0020"/>
+        <w:jc w:val="start"/>
+      </w:tblPr>
+      <w:tblGrid>
+        <w:gridCol w:w="1980"/>
+        <w:gridCol w:w="1980"/>
+        <w:gridCol w:w="1980"/>
+        <w:gridCol w:w="1980"/>
+      </w:tblGrid>
+      <w:tr>
+        <w:trPr>
+          <w:tblHeader w:val="true"/>
+        </w:trPr>
+        <w:tc>
+          <w:tcPr/>
+          <w:p>
+            <w:pPr>
+              <w:pStyle w:val="Compact"/>
+              <w:jc w:val="left"/>
+            </w:pPr>
+            <w:r>
+              <w:t xml:space="preserve">Bill</w:t>
+            </w:r>
+          </w:p>
+        </w:tc>
+        <w:tc>
+          <w:tcPr/>
+          <w:p>
+            <w:pPr>
+              <w:pStyle w:val="Compact"/>
+              <w:jc w:val="left"/>
+            </w:pPr>
+            <w:r>
+              <w:t xml:space="preserve">What it tried</w:t>
+            </w:r>
+          </w:p>
+        </w:tc>
+        <w:tc>
+          <w:tcPr/>
+          <w:p>
+            <w:pPr>
+              <w:pStyle w:val="Compact"/>
+              <w:jc w:val="left"/>
+            </w:pPr>
+            <w:r>
+              <w:t xml:space="preserve">Result</w:t>
+            </w:r>
+          </w:p>
+        </w:tc>
+        <w:tc>
+          <w:tcPr/>
+          <w:p>
+            <w:pPr>
+              <w:pStyle w:val="Compact"/>
+              <w:jc w:val="left"/>
+            </w:pPr>
+            <w:r>
+              <w:t xml:space="preserve">Where it ended</w:t>
+            </w:r>
+          </w:p>
+        </w:tc>
+      </w:tr>
+      <w:tr>
+        <w:tc>
+          <w:tcPr/>
+          <w:p>
+            <w:pPr>
+              <w:pStyle w:val="Compact"/>
+              <w:jc w:val="left"/>
+            </w:pPr>
+            <w:r>
+              <w:t xml:space="preserve">2019 AB51</w:t>
+            </w:r>
+          </w:p>
+        </w:tc>
+        <w:tc>
+          <w:tcPr/>
+          <w:p>
+            <w:pPr>
+              <w:pStyle w:val="Compact"/>
+              <w:jc w:val="left"/>
+            </w:pPr>
+            <w:r>
+              <w:t xml:space="preserve">Would have made the State Engineer write rules for managing all water sources together</w:t>
+            </w:r>
+          </w:p>
+        </w:tc>
+        <w:tc>
+          <w:tcPr/>
+          <w:p>
+            <w:pPr>
+              <w:pStyle w:val="Compact"/>
+              <w:jc w:val="left"/>
+            </w:pPr>
+            <w:r>
+              <w:t xml:space="preserve">Failed</w:t>
+            </w:r>
+          </w:p>
+        </w:tc>
+        <w:tc>
+          <w:tcPr/>
+          <w:p>
+            <w:pPr>
+              <w:pStyle w:val="Compact"/>
+              <w:jc w:val="left"/>
+            </w:pPr>
+            <w:r>
+              <w:t xml:space="preserve">Died in its first committee</w:t>
+            </w:r>
+          </w:p>
+        </w:tc>
+      </w:tr>
+      <w:tr>
+        <w:tc>
+          <w:tcPr/>
+          <w:p>
+            <w:pPr>
+              <w:pStyle w:val="Compact"/>
+              <w:jc w:val="left"/>
+            </w:pPr>
+            <w:r>
+              <w:t xml:space="preserve">2023 AB387</w:t>
+            </w:r>
+          </w:p>
+        </w:tc>
+        <w:tc>
+          <w:tcPr/>
+          <w:p>
+            <w:pPr>
+              <w:pStyle w:val="Compact"/>
+              <w:jc w:val="left"/>
+            </w:pPr>
+            <w:r>
+              <w:t xml:space="preserve">Would have made the State Engineer use the best available science</w:t>
+            </w:r>
+          </w:p>
+        </w:tc>
+        <w:tc>
+          <w:tcPr/>
+          <w:p>
+            <w:pPr>
+              <w:pStyle w:val="Compact"/>
+              <w:jc w:val="left"/>
+            </w:pPr>
+            <w:r>
+              <w:t xml:space="preserve">Failed</w:t>
+            </w:r>
+          </w:p>
+        </w:tc>
+        <w:tc>
+          <w:tcPr/>
+          <w:p>
+            <w:pPr>
+              <w:pStyle w:val="Compact"/>
+              <w:jc w:val="left"/>
+            </w:pPr>
+            <w:r>
+              <w:t xml:space="preserve">Died in the second house</w:t>
+            </w:r>
+          </w:p>
+        </w:tc>
+      </w:tr>
+    </w:tbl>
+    <w:p>
+      <w:pPr>
+        <w:pStyle w:val="BodyText"/>
+      </w:pPr>
+      <w:r>
+        <w:rPr>
+          <w:bCs/>
+          <w:b/>
+        </w:rPr>
+        <w:t xml:space="preserve">Open questions for a working group:</w:t>
+      </w:r>
+      <w:r>
+        <w:t xml:space="preserve"> </w:t>
+      </w:r>
+      <w:r>
+        <w:t xml:space="preserve">- Is the Senate the consistent wall for science-standard bills, and why?</w:t>
+      </w:r>
+      <w:r>
+        <w:t xml:space="preserve"> </w:t>
+      </w:r>
+      <w:r>
+        <w:t xml:space="preserve">- Which carve-outs are statutory vs. local practice?</w:t>
+      </w:r>
+    </w:p>
+    <w:bookmarkEnd w:id="53"/>
+    <w:bookmarkStart w:id="54" w:name="Xad179b9496dfae29a007d1e79531f4b0641af69"/>
+    <w:p>
+      <w:pPr>
+        <w:pStyle w:val="Heading2"/>
+      </w:pPr>
+      <w:r>
+        <w:t xml:space="preserve">10. Bring your own water - require developers and heavy users to import their own supply and add it to the cost.</w:t>
+      </w:r>
+    </w:p>
+    <w:p>
+      <w:pPr>
+        <w:numPr>
+          <w:ilvl w:val="0"/>
+          <w:numId w:val="1021"/>
+        </w:numPr>
+        <w:pStyle w:val="Compact"/>
+      </w:pPr>
+      <w:r>
+        <w:rPr>
+          <w:bCs/>
+          <w:b/>
+        </w:rPr>
+        <w:t xml:space="preserve">Status:</w:t>
+      </w:r>
+      <w:r>
+        <w:t xml:space="preserve"> </w:t>
+      </w:r>
+      <w:r>
+        <w:t xml:space="preserve">Never filed statewide</w:t>
+      </w:r>
+    </w:p>
+    <w:p>
+      <w:pPr>
+        <w:numPr>
+          <w:ilvl w:val="0"/>
+          <w:numId w:val="1021"/>
+        </w:numPr>
+        <w:pStyle w:val="Compact"/>
+      </w:pPr>
+      <w:r>
+        <w:rPr>
+          <w:bCs/>
+          <w:b/>
+        </w:rPr>
+        <w:t xml:space="preserve">The record:</w:t>
+      </w:r>
+      <w:r>
+        <w:t xml:space="preserve"> </w:t>
+      </w:r>
+      <w:r>
+        <w:t xml:space="preserve">No statewide bring-your-own-water statute has been filed. Closest enacted law: 80:SB250 (39-0) on dedicating water rights before land can be split into parcels. In practice northern Nevada already works this way - developers must buy rights and dedicate them plus an 11% drought reserve - but that is a water-authority rule (TMWA), not state law; southern Nevada works differently under Lake Mead rules.</w:t>
+      </w:r>
+    </w:p>
+    <w:p>
+      <w:pPr>
+        <w:numPr>
+          <w:ilvl w:val="0"/>
+          <w:numId w:val="1021"/>
+        </w:numPr>
+        <w:pStyle w:val="Compact"/>
+      </w:pPr>
+      <w:r>
+        <w:rPr>
+          <w:bCs/>
+          <w:b/>
+        </w:rPr>
+        <w:t xml:space="preserve">Where the decision sits:</w:t>
+      </w:r>
+      <w:r>
+        <w:t xml:space="preserve"> </w:t>
+      </w:r>
+      <w:r>
+        <w:t xml:space="preserve">Citizens’ fairness question (self-supplied users still use shared pipes) is a rate/tariff question that sits with utilities and the PUC today.</w:t>
+      </w:r>
+    </w:p>
+    <w:tbl>
+      <w:tblPr>
+        <w:tblStyle w:val="Table"/>
+        <w:tblW w:type="pct" w:w="5000"/>
+        <w:tblLook w:firstRow="1" w:lastRow="0" w:firstColumn="0" w:lastColumn="0" w:noHBand="0" w:noVBand="0" w:val="0020"/>
+        <w:jc w:val="start"/>
+      </w:tblPr>
+      <w:tblGrid>
+        <w:gridCol w:w="1980"/>
+        <w:gridCol w:w="1980"/>
+        <w:gridCol w:w="1980"/>
+        <w:gridCol w:w="1980"/>
+      </w:tblGrid>
+      <w:tr>
+        <w:trPr>
+          <w:tblHeader w:val="true"/>
+        </w:trPr>
+        <w:tc>
+          <w:tcPr/>
+          <w:p>
+            <w:pPr>
+              <w:pStyle w:val="Compact"/>
+              <w:jc w:val="left"/>
+            </w:pPr>
+            <w:r>
+              <w:t xml:space="preserve">Bill</w:t>
+            </w:r>
+          </w:p>
+        </w:tc>
+        <w:tc>
+          <w:tcPr/>
+          <w:p>
+            <w:pPr>
+              <w:pStyle w:val="Compact"/>
+              <w:jc w:val="left"/>
+            </w:pPr>
+            <w:r>
+              <w:t xml:space="preserve">What it tried</w:t>
+            </w:r>
+          </w:p>
+        </w:tc>
+        <w:tc>
+          <w:tcPr/>
+          <w:p>
+            <w:pPr>
+              <w:pStyle w:val="Compact"/>
+              <w:jc w:val="left"/>
+            </w:pPr>
+            <w:r>
+              <w:t xml:space="preserve">Result</w:t>
+            </w:r>
+          </w:p>
+        </w:tc>
+        <w:tc>
+          <w:tcPr/>
+          <w:p>
+            <w:pPr>
+              <w:pStyle w:val="Compact"/>
+              <w:jc w:val="left"/>
+            </w:pPr>
+            <w:r>
+              <w:t xml:space="preserve">Where it ended</w:t>
+            </w:r>
+          </w:p>
+        </w:tc>
+      </w:tr>
+      <w:tr>
+        <w:tc>
+          <w:tcPr/>
+          <w:p>
+            <w:pPr>
+              <w:pStyle w:val="Compact"/>
+              <w:jc w:val="left"/>
+            </w:pPr>
+            <w:r>
+              <w:t xml:space="preserve">2019 SB250</w:t>
+            </w:r>
+          </w:p>
+        </w:tc>
+        <w:tc>
+          <w:tcPr/>
+          <w:p>
+            <w:pPr>
+              <w:pStyle w:val="Compact"/>
+              <w:jc w:val="left"/>
+            </w:pPr>
+            <w:r>
+              <w:t xml:space="preserve">Rules on dedicating water rights before land can be split into parcels</w:t>
+            </w:r>
+          </w:p>
+        </w:tc>
+        <w:tc>
+          <w:tcPr/>
+          <w:p>
+            <w:pPr>
+              <w:pStyle w:val="Compact"/>
+              <w:jc w:val="left"/>
+            </w:pPr>
+            <w:r>
+              <w:t xml:space="preserve">Enacted</w:t>
+            </w:r>
+          </w:p>
+        </w:tc>
+        <w:tc>
+          <w:tcPr/>
+          <w:p>
+            <w:pPr>
+              <w:pStyle w:val="Compact"/>
+              <w:jc w:val="left"/>
+            </w:pPr>
+            <w:r>
+              <w:t xml:space="preserve">Became law</w:t>
+            </w:r>
+          </w:p>
+        </w:tc>
+      </w:tr>
+    </w:tbl>
+    <w:p>
+      <w:pPr>
+        <w:pStyle w:val="BodyText"/>
+      </w:pPr>
+      <w:r>
+        <w:rPr>
+          <w:bCs/>
+          <w:b/>
+        </w:rPr>
+        <w:t xml:space="preserve">Open questions for a working group:</w:t>
+      </w:r>
+      <w:r>
+        <w:t xml:space="preserve"> </w:t>
+      </w:r>
+      <w:r>
+        <w:t xml:space="preserve">- Would a statewide rule copy the northern model, and what happens where there is no market to buy rights?</w:t>
+      </w:r>
+      <w:r>
+        <w:t xml:space="preserve"> </w:t>
+      </w:r>
+      <w:r>
+        <w:t xml:space="preserve">- Who prices the use of shared transmission?</w:t>
+      </w:r>
+    </w:p>
+    <w:bookmarkEnd w:id="54"/>
+    <w:bookmarkEnd w:id="55"/>
     <w:sectPr/>
   </w:body>
 </w:document>
@@ -58933,6 +62528,36 @@
     <w:lvlOverride w:ilvl="8">
       <w:startOverride w:val="1"/>
     </w:lvlOverride>
+  </w:num>
+  <w:num w:numId="1012">
+    <w:abstractNumId w:val="991"/>
+  </w:num>
+  <w:num w:numId="1013">
+    <w:abstractNumId w:val="991"/>
+  </w:num>
+  <w:num w:numId="1014">
+    <w:abstractNumId w:val="991"/>
+  </w:num>
+  <w:num w:numId="1015">
+    <w:abstractNumId w:val="991"/>
+  </w:num>
+  <w:num w:numId="1016">
+    <w:abstractNumId w:val="991"/>
+  </w:num>
+  <w:num w:numId="1017">
+    <w:abstractNumId w:val="991"/>
+  </w:num>
+  <w:num w:numId="1018">
+    <w:abstractNumId w:val="991"/>
+  </w:num>
+  <w:num w:numId="1019">
+    <w:abstractNumId w:val="991"/>
+  </w:num>
+  <w:num w:numId="1020">
+    <w:abstractNumId w:val="991"/>
+  </w:num>
+  <w:num w:numId="1021">
+    <w:abstractNumId w:val="991"/>
   </w:num>
 </w:numbering>
 </file>

</xml_diff>

<commit_message>
Citizen brief v4.0: adult prose-only working-group brief, restyled 2-page Word export, reviewer material moved to Appendix I
Co-authored-by: CaptainWrechols <CaptainWrechols@users.noreply.github.com>
</commit_message>
<xml_diff>
--- a/briefs/nevada/water-scarcity/citizen-v1/appendices/appendices.docx
+++ b/briefs/nevada/water-scarcity/citizen-v1/appendices/appendices.docx
@@ -301,6 +301,35 @@
             </w:pPr>
             <w:r>
               <w:t xml:space="preserve">The ten most common citizen statements, each checked against the record</w:t>
+            </w:r>
+          </w:p>
+        </w:tc>
+      </w:tr>
+      <w:tr>
+        <w:tc>
+          <w:tcPr/>
+          <w:p>
+            <w:pPr>
+              <w:pStyle w:val="Compact"/>
+              <w:jc w:val="left"/>
+            </w:pPr>
+            <w:r>
+              <w:rPr>
+                <w:rStyle w:val="VerbatimChar"/>
+              </w:rPr>
+              <w:t xml:space="preserve">I-sources-and-review-notes.md</w:t>
+            </w:r>
+          </w:p>
+        </w:tc>
+        <w:tc>
+          <w:tcPr/>
+          <w:p>
+            <w:pPr>
+              <w:pStyle w:val="Compact"/>
+              <w:jc w:val="left"/>
+            </w:pPr>
+            <w:r>
+              <w:t xml:space="preserve">Claim-to-source mapping, collection notes, review status</w:t>
             </w:r>
           </w:p>
         </w:tc>
@@ -62199,6 +62228,1228 @@
     </w:p>
     <w:bookmarkEnd w:id="54"/>
     <w:bookmarkEnd w:id="55"/>
+    <w:bookmarkStart w:id="59" w:name="appendix-i-sources-and-review-notes"/>
+    <w:p>
+      <w:pPr>
+        <w:pStyle w:val="Heading1"/>
+      </w:pPr>
+      <w:r>
+        <w:t xml:space="preserve">Appendix I — Sources and review notes</w:t>
+      </w:r>
+    </w:p>
+    <w:p>
+      <w:pPr>
+        <w:pStyle w:val="FirstParagraph"/>
+      </w:pPr>
+      <w:r>
+        <w:t xml:space="preserve">This appendix holds the reviewer-facing material that does not belong in the</w:t>
+      </w:r>
+      <w:r>
+        <w:t xml:space="preserve"> </w:t>
+      </w:r>
+      <w:r>
+        <w:t xml:space="preserve">front brief: the claim-to-source mapping, data-collection notes, and review</w:t>
+      </w:r>
+      <w:r>
+        <w:t xml:space="preserve"> </w:t>
+      </w:r>
+      <w:r>
+        <w:t xml:space="preserve">status.</w:t>
+      </w:r>
+    </w:p>
+    <w:bookmarkStart w:id="56" w:name="how-this-record-was-assembled"/>
+    <w:p>
+      <w:pPr>
+        <w:pStyle w:val="Heading2"/>
+      </w:pPr>
+      <w:r>
+        <w:t xml:space="preserve">How this record was assembled</w:t>
+      </w:r>
+    </w:p>
+    <w:p>
+      <w:pPr>
+        <w:pStyle w:val="FirstParagraph"/>
+      </w:pPr>
+      <w:r>
+        <w:t xml:space="preserve">Bills were discovered two ways for the 2019, 2021, 2023, and 2025 sessions:</w:t>
+      </w:r>
+      <w:r>
+        <w:t xml:space="preserve"> </w:t>
+      </w:r>
+      <w:r>
+        <w:t xml:space="preserve">NELIS keyword search (water, groundwater, Colorado River, data center,</w:t>
+      </w:r>
+      <w:r>
+        <w:t xml:space="preserve"> </w:t>
+      </w:r>
+      <w:r>
+        <w:t xml:space="preserve">partial abatement, and related terms) and a full harvest of the Legislative</w:t>
+      </w:r>
+      <w:r>
+        <w:t xml:space="preserve"> </w:t>
+      </w:r>
+      <w:r>
+        <w:t xml:space="preserve">Counsel Bureau’s official Subject Index of Bills (WATER, WATER RIGHTS AND</w:t>
+      </w:r>
+      <w:r>
+        <w:t xml:space="preserve"> </w:t>
+      </w:r>
+      <w:r>
+        <w:t xml:space="preserve">APPROPRIATION OF PUBLIC WATERS, STATE ENGINEER, DROUGHT, IRRIGATION, DATA</w:t>
+      </w:r>
+      <w:r>
+        <w:t xml:space="preserve"> </w:t>
+      </w:r>
+      <w:r>
+        <w:t xml:space="preserve">CENTERS, RIVERS, FLOOD CONTROL, SEWAGE, TAHOE, and related headings). All six</w:t>
+      </w:r>
+      <w:r>
+        <w:t xml:space="preserve"> </w:t>
+      </w:r>
+      <w:r>
+        <w:t xml:space="preserve">2020–2025 special sessions were checked; none contained water or data-center</w:t>
+      </w:r>
+      <w:r>
+        <w:t xml:space="preserve"> </w:t>
+      </w:r>
+      <w:r>
+        <w:t xml:space="preserve">bills. The search yielded 189 bills, hand-curated into 108 policy bills (the</w:t>
+      </w:r>
+      <w:r>
+        <w:t xml:space="preserve"> </w:t>
+      </w:r>
+      <w:r>
+        <w:t xml:space="preserve">basis for all headline numbers) and 81 context bills kept for audit. This is</w:t>
+      </w:r>
+      <w:r>
+        <w:t xml:space="preserve"> </w:t>
+      </w:r>
+      <w:r>
+        <w:t xml:space="preserve">broad, double-source coverage but not a provably complete universe; the</w:t>
+      </w:r>
+      <w:r>
+        <w:t xml:space="preserve"> </w:t>
+      </w:r>
+      <w:r>
+        <w:t xml:space="preserve">record shows where each bill stopped, never why. Committee Yea votes are</w:t>
+      </w:r>
+      <w:r>
+        <w:t xml:space="preserve"> </w:t>
+      </w:r>
+      <w:r>
+        <w:t xml:space="preserve">partly inferred (committee membership minus recorded Nay/Absent) because</w:t>
+      </w:r>
+      <w:r>
+        <w:t xml:space="preserve"> </w:t>
+      </w:r>
+      <w:r>
+        <w:t xml:space="preserve">Nevada minutes usually list only No and Absent votes; those rows are marked</w:t>
+      </w:r>
+      <w:r>
+        <w:t xml:space="preserve"> </w:t>
+      </w:r>
+      <w:r>
+        <w:t xml:space="preserve">in the source data. Party labels come from official NELIS legislator</w:t>
+      </w:r>
+      <w:r>
+        <w:t xml:space="preserve"> </w:t>
+      </w:r>
+      <w:r>
+        <w:t xml:space="preserve">rosters (100% of roll-call rows matched).</w:t>
+      </w:r>
+    </w:p>
+    <w:bookmarkEnd w:id="56"/>
+    <w:bookmarkStart w:id="57" w:name="claim-to-source-mapping-front-brief"/>
+    <w:p>
+      <w:pPr>
+        <w:pStyle w:val="Heading2"/>
+      </w:pPr>
+      <w:r>
+        <w:t xml:space="preserve">Claim-to-source mapping (front brief)</w:t>
+      </w:r>
+    </w:p>
+    <w:p>
+      <w:pPr>
+        <w:pStyle w:val="FirstParagraph"/>
+      </w:pPr>
+      <w:r>
+        <w:t xml:space="preserve">Bill keys are</w:t>
+      </w:r>
+      <w:r>
+        <w:t xml:space="preserve"> </w:t>
+      </w:r>
+      <w:r>
+        <w:rPr>
+          <w:rStyle w:val="VerbatimChar"/>
+        </w:rPr>
+        <w:t xml:space="preserve">session:identifier</w:t>
+      </w:r>
+      <w:r>
+        <w:t xml:space="preserve"> </w:t>
+      </w:r>
+      <w:r>
+        <w:t xml:space="preserve">(80=2019, 81=2021, 82=2023, 83=2025).</w:t>
+      </w:r>
+      <w:r>
+        <w:t xml:space="preserve"> </w:t>
+      </w:r>
+      <w:r>
+        <w:t xml:space="preserve">Machine sources live in</w:t>
+      </w:r>
+      <w:r>
+        <w:t xml:space="preserve"> </w:t>
+      </w:r>
+      <w:r>
+        <w:rPr>
+          <w:rStyle w:val="VerbatimChar"/>
+        </w:rPr>
+        <w:t xml:space="preserve">working/nevada/water-scarcity/evidence-pack.json</w:t>
+      </w:r>
+      <w:r>
+        <w:t xml:space="preserve"> </w:t>
+      </w:r>
+      <w:r>
+        <w:t xml:space="preserve">and</w:t>
+      </w:r>
+      <w:r>
+        <w:t xml:space="preserve"> </w:t>
+      </w:r>
+      <w:r>
+        <w:rPr>
+          <w:rStyle w:val="VerbatimChar"/>
+        </w:rPr>
+        <w:t xml:space="preserve">reality-map.json</w:t>
+      </w:r>
+      <w:r>
+        <w:t xml:space="preserve">.</w:t>
+      </w:r>
+    </w:p>
+    <w:tbl>
+      <w:tblPr>
+        <w:tblStyle w:val="Table"/>
+        <w:tblW w:type="pct" w:w="5000"/>
+        <w:tblLook w:firstRow="1" w:lastRow="0" w:firstColumn="0" w:lastColumn="0" w:noHBand="0" w:noVBand="0" w:val="0020"/>
+        <w:jc w:val="start"/>
+      </w:tblPr>
+      <w:tblGrid>
+        <w:gridCol w:w="3960"/>
+        <w:gridCol w:w="3960"/>
+      </w:tblGrid>
+      <w:tr>
+        <w:trPr>
+          <w:tblHeader w:val="true"/>
+        </w:trPr>
+        <w:tc>
+          <w:tcPr/>
+          <w:p>
+            <w:pPr>
+              <w:pStyle w:val="Compact"/>
+              <w:jc w:val="left"/>
+            </w:pPr>
+            <w:r>
+              <w:t xml:space="preserve">Front-brief claim</w:t>
+            </w:r>
+          </w:p>
+        </w:tc>
+        <w:tc>
+          <w:tcPr/>
+          <w:p>
+            <w:pPr>
+              <w:pStyle w:val="Compact"/>
+              <w:jc w:val="left"/>
+            </w:pPr>
+            <w:r>
+              <w:t xml:space="preserve">Evidence</w:t>
+            </w:r>
+          </w:p>
+        </w:tc>
+      </w:tr>
+      <w:tr>
+        <w:tc>
+          <w:tcPr/>
+          <w:p>
+            <w:pPr>
+              <w:pStyle w:val="Compact"/>
+              <w:jc w:val="left"/>
+            </w:pPr>
+            <w:r>
+              <w:t xml:space="preserve">108 policy bills; 59 enacted; 27 first-committee deaths (15 in Natural Resources); 3 vetoes; 2025 pass rate 13 of 31</w:t>
+            </w:r>
+          </w:p>
+        </w:tc>
+        <w:tc>
+          <w:tcPr/>
+          <w:p>
+            <w:pPr>
+              <w:pStyle w:val="Compact"/>
+              <w:jc w:val="left"/>
+            </w:pPr>
+            <w:r>
+              <w:rPr>
+                <w:rStyle w:val="VerbatimChar"/>
+              </w:rPr>
+              <w:t xml:space="preserve">evidence-pack.json → inventory</w:t>
+            </w:r>
+            <w:r>
+              <w:t xml:space="preserve">,</w:t>
+            </w:r>
+            <w:r>
+              <w:t xml:space="preserve"> </w:t>
+            </w:r>
+            <w:r>
+              <w:rPr>
+                <w:rStyle w:val="VerbatimChar"/>
+              </w:rPr>
+              <w:t xml:space="preserve">people_signals</w:t>
+            </w:r>
+            <w:r>
+              <w:t xml:space="preserve">;</w:t>
+            </w:r>
+            <w:r>
+              <w:t xml:space="preserve"> </w:t>
+            </w:r>
+            <w:r>
+              <w:rPr>
+                <w:rStyle w:val="VerbatimChar"/>
+              </w:rPr>
+              <w:t xml:space="preserve">reality-map.json → session_snapshot</w:t>
+            </w:r>
+          </w:p>
+        </w:tc>
+      </w:tr>
+      <w:tr>
+        <w:tc>
+          <w:tcPr/>
+          <w:p>
+            <w:pPr>
+              <w:pStyle w:val="Compact"/>
+              <w:jc w:val="left"/>
+            </w:pPr>
+            <w:r>
+              <w:t xml:space="preserve">5 of 10 proposals never introduced</w:t>
+            </w:r>
+          </w:p>
+        </w:tc>
+        <w:tc>
+          <w:tcPr/>
+          <w:p>
+            <w:pPr>
+              <w:pStyle w:val="Compact"/>
+              <w:jc w:val="left"/>
+            </w:pPr>
+            <w:r>
+              <w:rPr>
+                <w:rStyle w:val="VerbatimChar"/>
+              </w:rPr>
+              <w:t xml:space="preserve">evidence-pack.json → constituent_proposal_crosswalk</w:t>
+            </w:r>
+            <w:r>
+              <w:t xml:space="preserve">; statuses in</w:t>
+            </w:r>
+            <w:r>
+              <w:t xml:space="preserve"> </w:t>
+            </w:r>
+            <w:r>
+              <w:rPr>
+                <w:rStyle w:val="VerbatimChar"/>
+              </w:rPr>
+              <w:t xml:space="preserve">reality-map.json → proposal_reality_cards</w:t>
+            </w:r>
+          </w:p>
+        </w:tc>
+      </w:tr>
+      <w:tr>
+        <w:tc>
+          <w:tcPr/>
+          <w:p>
+            <w:pPr>
+              <w:pStyle w:val="Compact"/>
+              <w:jc w:val="left"/>
+            </w:pPr>
+            <w:r>
+              <w:t xml:space="preserve">Data centers: no water/cooling bill; SB547 exemption; AB385 preemption death</w:t>
+            </w:r>
+          </w:p>
+        </w:tc>
+        <w:tc>
+          <w:tcPr/>
+          <w:p>
+            <w:pPr>
+              <w:pStyle w:val="Compact"/>
+              <w:jc w:val="left"/>
+            </w:pPr>
+            <w:r>
+              <w:rPr>
+                <w:rStyle w:val="VerbatimChar"/>
+              </w:rPr>
+              <w:t xml:space="preserve">80:SB547</w:t>
+            </w:r>
+            <w:r>
+              <w:t xml:space="preserve">,</w:t>
+            </w:r>
+            <w:r>
+              <w:t xml:space="preserve"> </w:t>
+            </w:r>
+            <w:r>
+              <w:rPr>
+                <w:rStyle w:val="VerbatimChar"/>
+              </w:rPr>
+              <w:t xml:space="preserve">83:AB385</w:t>
+            </w:r>
+            <w:r>
+              <w:t xml:space="preserve">; abatement statutes NRS 360.754 et seq.; SNWA moratorium + TMWA dedication practice from LCB memo S25 (2026-03-20)</w:t>
+            </w:r>
+          </w:p>
+        </w:tc>
+      </w:tr>
+      <w:tr>
+        <w:tc>
+          <w:tcPr/>
+          <w:p>
+            <w:pPr>
+              <w:pStyle w:val="Compact"/>
+              <w:jc w:val="left"/>
+            </w:pPr>
+            <w:r>
+              <w:t xml:space="preserve">Metering edges</w:t>
+            </w:r>
+          </w:p>
+        </w:tc>
+        <w:tc>
+          <w:tcPr/>
+          <w:p>
+            <w:pPr>
+              <w:pStyle w:val="Compact"/>
+              <w:jc w:val="left"/>
+            </w:pPr>
+            <w:r>
+              <w:rPr>
+                <w:rStyle w:val="VerbatimChar"/>
+              </w:rPr>
+              <w:t xml:space="preserve">80:AB95</w:t>
+            </w:r>
+            <w:r>
+              <w:t xml:space="preserve">,</w:t>
+            </w:r>
+            <w:r>
+              <w:t xml:space="preserve"> </w:t>
+            </w:r>
+            <w:r>
+              <w:rPr>
+                <w:rStyle w:val="VerbatimChar"/>
+              </w:rPr>
+              <w:t xml:space="preserve">82:SB113</w:t>
+            </w:r>
+            <w:r>
+              <w:t xml:space="preserve">,</w:t>
+            </w:r>
+            <w:r>
+              <w:t xml:space="preserve"> </w:t>
+            </w:r>
+            <w:r>
+              <w:rPr>
+                <w:rStyle w:val="VerbatimChar"/>
+              </w:rPr>
+              <w:t xml:space="preserve">82:AB191</w:t>
+            </w:r>
+          </w:p>
+        </w:tc>
+      </w:tr>
+      <w:tr>
+        <w:tc>
+          <w:tcPr/>
+          <w:p>
+            <w:pPr>
+              <w:pStyle w:val="Compact"/>
+              <w:jc w:val="left"/>
+            </w:pPr>
+            <w:r>
+              <w:t xml:space="preserve">Waste fines nearest statute</w:t>
+            </w:r>
+          </w:p>
+        </w:tc>
+        <w:tc>
+          <w:tcPr/>
+          <w:p>
+            <w:pPr>
+              <w:pStyle w:val="Compact"/>
+              <w:jc w:val="left"/>
+            </w:pPr>
+            <w:r>
+              <w:rPr>
+                <w:rStyle w:val="VerbatimChar"/>
+              </w:rPr>
+              <w:t xml:space="preserve">80:AB537</w:t>
+            </w:r>
+          </w:p>
+        </w:tc>
+      </w:tr>
+      <w:tr>
+        <w:tc>
+          <w:tcPr/>
+          <w:p>
+            <w:pPr>
+              <w:pStyle w:val="Compact"/>
+              <w:jc w:val="left"/>
+            </w:pPr>
+            <w:r>
+              <w:t xml:space="preserve">Reimbursement design never filed</w:t>
+            </w:r>
+          </w:p>
+        </w:tc>
+        <w:tc>
+          <w:tcPr/>
+          <w:p>
+            <w:pPr>
+              <w:pStyle w:val="Compact"/>
+              <w:jc w:val="left"/>
+            </w:pPr>
+            <w:r>
+              <w:t xml:space="preserve">crosswalk</w:t>
+            </w:r>
+            <w:r>
+              <w:t xml:space="preserve"> </w:t>
+            </w:r>
+            <w:r>
+              <w:rPr>
+                <w:rStyle w:val="VerbatimChar"/>
+              </w:rPr>
+              <w:t xml:space="preserve">conditional-tax-incentives</w:t>
+            </w:r>
+            <w:r>
+              <w:t xml:space="preserve"> </w:t>
+            </w:r>
+            <w:r>
+              <w:t xml:space="preserve">(matched bills are conditioning attempts, not the reimbursement design)</w:t>
+            </w:r>
+          </w:p>
+        </w:tc>
+      </w:tr>
+      <w:tr>
+        <w:tc>
+          <w:tcPr/>
+          <w:p>
+            <w:pPr>
+              <w:pStyle w:val="Compact"/>
+              <w:jc w:val="left"/>
+            </w:pPr>
+            <w:r>
+              <w:t xml:space="preserve">Bring your own water / dedication</w:t>
+            </w:r>
+          </w:p>
+        </w:tc>
+        <w:tc>
+          <w:tcPr/>
+          <w:p>
+            <w:pPr>
+              <w:pStyle w:val="Compact"/>
+              <w:jc w:val="left"/>
+            </w:pPr>
+            <w:r>
+              <w:rPr>
+                <w:rStyle w:val="VerbatimChar"/>
+              </w:rPr>
+              <w:t xml:space="preserve">80:SB250</w:t>
+            </w:r>
+            <w:r>
+              <w:t xml:space="preserve"> </w:t>
+            </w:r>
+            <w:r>
+              <w:t xml:space="preserve">(39–0); TMWA 11% drought reserve from LCB memo S25</w:t>
+            </w:r>
+          </w:p>
+        </w:tc>
+      </w:tr>
+      <w:tr>
+        <w:tc>
+          <w:tcPr/>
+          <w:p>
+            <w:pPr>
+              <w:pStyle w:val="Compact"/>
+              <w:jc w:val="left"/>
+            </w:pPr>
+            <w:r>
+              <w:t xml:space="preserve">Expert water body</w:t>
+            </w:r>
+          </w:p>
+        </w:tc>
+        <w:tc>
+          <w:tcPr/>
+          <w:p>
+            <w:pPr>
+              <w:pStyle w:val="Compact"/>
+              <w:jc w:val="left"/>
+            </w:pPr>
+            <w:r>
+              <w:rPr>
+                <w:rStyle w:val="VerbatimChar"/>
+              </w:rPr>
+              <w:t xml:space="preserve">80:SB499</w:t>
+            </w:r>
+            <w:r>
+              <w:t xml:space="preserve"> </w:t>
+            </w:r>
+            <w:r>
+              <w:t xml:space="preserve">(first committee),</w:t>
+            </w:r>
+            <w:r>
+              <w:t xml:space="preserve"> </w:t>
+            </w:r>
+            <w:r>
+              <w:rPr>
+                <w:rStyle w:val="VerbatimChar"/>
+              </w:rPr>
+              <w:t xml:space="preserve">83:SB143</w:t>
+            </w:r>
+            <w:r>
+              <w:t xml:space="preserve"> </w:t>
+            </w:r>
+            <w:r>
+              <w:t xml:space="preserve">(Senate 21–0, died in Assembly)</w:t>
+            </w:r>
+          </w:p>
+        </w:tc>
+      </w:tr>
+      <w:tr>
+        <w:tc>
+          <w:tcPr/>
+          <w:p>
+            <w:pPr>
+              <w:pStyle w:val="Compact"/>
+              <w:jc w:val="left"/>
+            </w:pPr>
+            <w:r>
+              <w:t xml:space="preserve">Records/audit</w:t>
+            </w:r>
+          </w:p>
+        </w:tc>
+        <w:tc>
+          <w:tcPr/>
+          <w:p>
+            <w:pPr>
+              <w:pStyle w:val="Compact"/>
+              <w:jc w:val="left"/>
+            </w:pPr>
+            <w:r>
+              <w:rPr>
+                <w:rStyle w:val="VerbatimChar"/>
+              </w:rPr>
+              <w:t xml:space="preserve">83:AB485</w:t>
+            </w:r>
+            <w:r>
+              <w:t xml:space="preserve"> </w:t>
+            </w:r>
+            <w:r>
+              <w:t xml:space="preserve">(first committee); passed pieces</w:t>
+            </w:r>
+            <w:r>
+              <w:t xml:space="preserve"> </w:t>
+            </w:r>
+            <w:r>
+              <w:rPr>
+                <w:rStyle w:val="VerbatimChar"/>
+              </w:rPr>
+              <w:t xml:space="preserve">80:AB95</w:t>
+            </w:r>
+            <w:r>
+              <w:t xml:space="preserve">,</w:t>
+            </w:r>
+            <w:r>
+              <w:t xml:space="preserve"> </w:t>
+            </w:r>
+            <w:r>
+              <w:rPr>
+                <w:rStyle w:val="VerbatimChar"/>
+              </w:rPr>
+              <w:t xml:space="preserve">82:SB113</w:t>
+            </w:r>
+            <w:r>
+              <w:t xml:space="preserve">,</w:t>
+            </w:r>
+            <w:r>
+              <w:t xml:space="preserve"> </w:t>
+            </w:r>
+            <w:r>
+              <w:rPr>
+                <w:rStyle w:val="VerbatimChar"/>
+              </w:rPr>
+              <w:t xml:space="preserve">83:AB577</w:t>
+            </w:r>
+            <w:r>
+              <w:t xml:space="preserve">,</w:t>
+            </w:r>
+            <w:r>
+              <w:t xml:space="preserve"> </w:t>
+            </w:r>
+            <w:r>
+              <w:rPr>
+                <w:rStyle w:val="VerbatimChar"/>
+              </w:rPr>
+              <w:t xml:space="preserve">83:SB36</w:t>
+            </w:r>
+            <w:r>
+              <w:t xml:space="preserve"> </w:t>
+            </w:r>
+            <w:r>
+              <w:t xml:space="preserve">(prior failures</w:t>
+            </w:r>
+            <w:r>
+              <w:t xml:space="preserve"> </w:t>
+            </w:r>
+            <w:r>
+              <w:rPr>
+                <w:rStyle w:val="VerbatimChar"/>
+              </w:rPr>
+              <w:t xml:space="preserve">81:AB354</w:t>
+            </w:r>
+            <w:r>
+              <w:t xml:space="preserve">,</w:t>
+            </w:r>
+            <w:r>
+              <w:t xml:space="preserve"> </w:t>
+            </w:r>
+            <w:r>
+              <w:rPr>
+                <w:rStyle w:val="VerbatimChar"/>
+              </w:rPr>
+              <w:t xml:space="preserve">82:SB176</w:t>
+            </w:r>
+            <w:r>
+              <w:t xml:space="preserve">)</w:t>
+            </w:r>
+          </w:p>
+        </w:tc>
+      </w:tr>
+      <w:tr>
+        <w:tc>
+          <w:tcPr/>
+          <w:p>
+            <w:pPr>
+              <w:pStyle w:val="Compact"/>
+              <w:jc w:val="left"/>
+            </w:pPr>
+            <w:r>
+              <w:t xml:space="preserve">Abatement conditions 0-for-5</w:t>
+            </w:r>
+          </w:p>
+        </w:tc>
+        <w:tc>
+          <w:tcPr/>
+          <w:p>
+            <w:pPr>
+              <w:pStyle w:val="Compact"/>
+              <w:jc w:val="left"/>
+            </w:pPr>
+            <w:r>
+              <w:rPr>
+                <w:rStyle w:val="VerbatimChar"/>
+              </w:rPr>
+              <w:t xml:space="preserve">83:AB77</w:t>
+            </w:r>
+            <w:r>
+              <w:t xml:space="preserve">,</w:t>
+            </w:r>
+            <w:r>
+              <w:t xml:space="preserve"> </w:t>
+            </w:r>
+            <w:r>
+              <w:rPr>
+                <w:rStyle w:val="VerbatimChar"/>
+              </w:rPr>
+              <w:t xml:space="preserve">82:SB394</w:t>
+            </w:r>
+            <w:r>
+              <w:t xml:space="preserve"> </w:t>
+            </w:r>
+            <w:r>
+              <w:t xml:space="preserve">(Senate 14–7),</w:t>
+            </w:r>
+            <w:r>
+              <w:t xml:space="preserve"> </w:t>
+            </w:r>
+            <w:r>
+              <w:rPr>
+                <w:rStyle w:val="VerbatimChar"/>
+              </w:rPr>
+              <w:t xml:space="preserve">82:SB429</w:t>
+            </w:r>
+            <w:r>
+              <w:t xml:space="preserve"> </w:t>
+            </w:r>
+            <w:r>
+              <w:t xml:space="preserve">(vetoed),</w:t>
+            </w:r>
+            <w:r>
+              <w:t xml:space="preserve"> </w:t>
+            </w:r>
+            <w:r>
+              <w:rPr>
+                <w:rStyle w:val="VerbatimChar"/>
+              </w:rPr>
+              <w:t xml:space="preserve">81:AB449</w:t>
+            </w:r>
+            <w:r>
+              <w:t xml:space="preserve">,</w:t>
+            </w:r>
+            <w:r>
+              <w:t xml:space="preserve"> </w:t>
+            </w:r>
+            <w:r>
+              <w:rPr>
+                <w:rStyle w:val="VerbatimChar"/>
+              </w:rPr>
+              <w:t xml:space="preserve">83:SB364</w:t>
+            </w:r>
+          </w:p>
+        </w:tc>
+      </w:tr>
+      <w:tr>
+        <w:tc>
+          <w:tcPr/>
+          <w:p>
+            <w:pPr>
+              <w:pStyle w:val="Compact"/>
+              <w:jc w:val="left"/>
+            </w:pPr>
+            <w:r>
+              <w:t xml:space="preserve">Statewide standards</w:t>
+            </w:r>
+          </w:p>
+        </w:tc>
+        <w:tc>
+          <w:tcPr/>
+          <w:p>
+            <w:pPr>
+              <w:pStyle w:val="Compact"/>
+              <w:jc w:val="left"/>
+            </w:pPr>
+            <w:r>
+              <w:rPr>
+                <w:rStyle w:val="VerbatimChar"/>
+              </w:rPr>
+              <w:t xml:space="preserve">80:AB51</w:t>
+            </w:r>
+            <w:r>
+              <w:t xml:space="preserve">,</w:t>
+            </w:r>
+            <w:r>
+              <w:t xml:space="preserve"> </w:t>
+            </w:r>
+            <w:r>
+              <w:rPr>
+                <w:rStyle w:val="VerbatimChar"/>
+              </w:rPr>
+              <w:t xml:space="preserve">82:AB387</w:t>
+            </w:r>
+            <w:r>
+              <w:t xml:space="preserve"> </w:t>
+            </w:r>
+            <w:r>
+              <w:t xml:space="preserve">(Assembly 26–14); oversight theme 0-for-6 in</w:t>
+            </w:r>
+            <w:r>
+              <w:t xml:space="preserve"> </w:t>
+            </w:r>
+            <w:r>
+              <w:rPr>
+                <w:rStyle w:val="VerbatimChar"/>
+              </w:rPr>
+              <w:t xml:space="preserve">reality-map.json → theme_scorecards</w:t>
+            </w:r>
+          </w:p>
+        </w:tc>
+      </w:tr>
+      <w:tr>
+        <w:tc>
+          <w:tcPr/>
+          <w:p>
+            <w:pPr>
+              <w:pStyle w:val="Compact"/>
+              <w:jc w:val="left"/>
+            </w:pPr>
+            <w:r>
+              <w:t xml:space="preserve">Growth restrictions precedent</w:t>
+            </w:r>
+          </w:p>
+        </w:tc>
+        <w:tc>
+          <w:tcPr/>
+          <w:p>
+            <w:pPr>
+              <w:pStyle w:val="Compact"/>
+              <w:jc w:val="left"/>
+            </w:pPr>
+            <w:r>
+              <w:rPr>
+                <w:rStyle w:val="VerbatimChar"/>
+              </w:rPr>
+              <w:t xml:space="preserve">81:AB356</w:t>
+            </w:r>
+            <w:r>
+              <w:t xml:space="preserve"> </w:t>
+            </w:r>
+            <w:r>
+              <w:t xml:space="preserve">(21–0, 42–0),</w:t>
+            </w:r>
+            <w:r>
+              <w:t xml:space="preserve"> </w:t>
+            </w:r>
+            <w:r>
+              <w:rPr>
+                <w:rStyle w:val="VerbatimChar"/>
+              </w:rPr>
+              <w:t xml:space="preserve">80:SB250</w:t>
+            </w:r>
+            <w:r>
+              <w:t xml:space="preserve">,</w:t>
+            </w:r>
+            <w:r>
+              <w:t xml:space="preserve"> </w:t>
+            </w:r>
+            <w:r>
+              <w:rPr>
+                <w:rStyle w:val="VerbatimChar"/>
+              </w:rPr>
+              <w:t xml:space="preserve">82:SB169</w:t>
+            </w:r>
+            <w:r>
+              <w:t xml:space="preserve"> </w:t>
+            </w:r>
+            <w:r>
+              <w:t xml:space="preserve">(vetoed),</w:t>
+            </w:r>
+            <w:r>
+              <w:t xml:space="preserve"> </w:t>
+            </w:r>
+            <w:r>
+              <w:rPr>
+                <w:rStyle w:val="VerbatimChar"/>
+              </w:rPr>
+              <w:t xml:space="preserve">83:SB143</w:t>
+            </w:r>
+          </w:p>
+        </w:tc>
+      </w:tr>
+      <w:tr>
+        <w:tc>
+          <w:tcPr/>
+          <w:p>
+            <w:pPr>
+              <w:pStyle w:val="Compact"/>
+              <w:jc w:val="left"/>
+            </w:pPr>
+            <w:r>
+              <w:t xml:space="preserve">Groundwater reform</w:t>
+            </w:r>
+          </w:p>
+        </w:tc>
+        <w:tc>
+          <w:tcPr/>
+          <w:p>
+            <w:pPr>
+              <w:pStyle w:val="Compact"/>
+              <w:jc w:val="left"/>
+            </w:pPr>
+            <w:r>
+              <w:rPr>
+                <w:rStyle w:val="VerbatimChar"/>
+              </w:rPr>
+              <w:t xml:space="preserve">82:SB113</w:t>
+            </w:r>
+            <w:r>
+              <w:t xml:space="preserve">,</w:t>
+            </w:r>
+            <w:r>
+              <w:t xml:space="preserve"> </w:t>
+            </w:r>
+            <w:r>
+              <w:rPr>
+                <w:rStyle w:val="VerbatimChar"/>
+              </w:rPr>
+              <w:t xml:space="preserve">83:SB36</w:t>
+            </w:r>
+            <w:r>
+              <w:t xml:space="preserve">,</w:t>
+            </w:r>
+            <w:r>
+              <w:t xml:space="preserve"> </w:t>
+            </w:r>
+            <w:r>
+              <w:rPr>
+                <w:rStyle w:val="VerbatimChar"/>
+              </w:rPr>
+              <w:t xml:space="preserve">82:SB180</w:t>
+            </w:r>
+            <w:r>
+              <w:t xml:space="preserve"> </w:t>
+            </w:r>
+            <w:r>
+              <w:t xml:space="preserve">(41–0 + unanimous, died),</w:t>
+            </w:r>
+            <w:r>
+              <w:t xml:space="preserve"> </w:t>
+            </w:r>
+            <w:r>
+              <w:rPr>
+                <w:rStyle w:val="VerbatimChar"/>
+              </w:rPr>
+              <w:t xml:space="preserve">83:AB363</w:t>
+            </w:r>
+          </w:p>
+        </w:tc>
+      </w:tr>
+      <w:tr>
+        <w:tc>
+          <w:tcPr/>
+          <w:p>
+            <w:pPr>
+              <w:pStyle w:val="Compact"/>
+              <w:jc w:val="left"/>
+            </w:pPr>
+            <w:r>
+              <w:t xml:space="preserve">Political terrain (sponsorship, committees)</w:t>
+            </w:r>
+          </w:p>
+        </w:tc>
+        <w:tc>
+          <w:tcPr/>
+          <w:p>
+            <w:pPr>
+              <w:pStyle w:val="Compact"/>
+              <w:jc w:val="left"/>
+            </w:pPr>
+            <w:r>
+              <w:rPr>
+                <w:rStyle w:val="VerbatimChar"/>
+              </w:rPr>
+              <w:t xml:space="preserve">evidence-pack.json → people_signals</w:t>
+            </w:r>
+            <w:r>
+              <w:t xml:space="preserve">; chokepoint counts in</w:t>
+            </w:r>
+            <w:r>
+              <w:t xml:space="preserve"> </w:t>
+            </w:r>
+            <w:r>
+              <w:rPr>
+                <w:rStyle w:val="VerbatimChar"/>
+              </w:rPr>
+              <w:t xml:space="preserve">reality-map.json → people_and_process_signals</w:t>
+            </w:r>
+          </w:p>
+        </w:tc>
+      </w:tr>
+      <w:tr>
+        <w:tc>
+          <w:tcPr/>
+          <w:p>
+            <w:pPr>
+              <w:pStyle w:val="Compact"/>
+              <w:jc w:val="left"/>
+            </w:pPr>
+            <w:r>
+              <w:t xml:space="preserve">New 2025 law</w:t>
+            </w:r>
+          </w:p>
+        </w:tc>
+        <w:tc>
+          <w:tcPr/>
+          <w:p>
+            <w:pPr>
+              <w:pStyle w:val="Compact"/>
+              <w:jc w:val="left"/>
+            </w:pPr>
+            <w:r>
+              <w:rPr>
+                <w:rStyle w:val="VerbatimChar"/>
+              </w:rPr>
+              <w:t xml:space="preserve">83:SB36</w:t>
+            </w:r>
+            <w:r>
+              <w:t xml:space="preserve">,</w:t>
+            </w:r>
+            <w:r>
+              <w:t xml:space="preserve"> </w:t>
+            </w:r>
+            <w:r>
+              <w:rPr>
+                <w:rStyle w:val="VerbatimChar"/>
+              </w:rPr>
+              <w:t xml:space="preserve">83:SB6</w:t>
+            </w:r>
+            <w:r>
+              <w:t xml:space="preserve">,</w:t>
+            </w:r>
+            <w:r>
+              <w:t xml:space="preserve"> </w:t>
+            </w:r>
+            <w:r>
+              <w:rPr>
+                <w:rStyle w:val="VerbatimChar"/>
+              </w:rPr>
+              <w:t xml:space="preserve">83:SB442</w:t>
+            </w:r>
+            <w:r>
+              <w:t xml:space="preserve">,</w:t>
+            </w:r>
+            <w:r>
+              <w:t xml:space="preserve"> </w:t>
+            </w:r>
+            <w:r>
+              <w:rPr>
+                <w:rStyle w:val="VerbatimChar"/>
+              </w:rPr>
+              <w:t xml:space="preserve">83:SB276</w:t>
+            </w:r>
+            <w:r>
+              <w:t xml:space="preserve">,</w:t>
+            </w:r>
+            <w:r>
+              <w:t xml:space="preserve"> </w:t>
+            </w:r>
+            <w:r>
+              <w:rPr>
+                <w:rStyle w:val="VerbatimChar"/>
+              </w:rPr>
+              <w:t xml:space="preserve">83:AB449</w:t>
+            </w:r>
+            <w:r>
+              <w:t xml:space="preserve">,</w:t>
+            </w:r>
+            <w:r>
+              <w:t xml:space="preserve"> </w:t>
+            </w:r>
+            <w:r>
+              <w:rPr>
+                <w:rStyle w:val="VerbatimChar"/>
+              </w:rPr>
+              <w:t xml:space="preserve">83:SB326</w:t>
+            </w:r>
+            <w:r>
+              <w:t xml:space="preserve">,</w:t>
+            </w:r>
+            <w:r>
+              <w:t xml:space="preserve"> </w:t>
+            </w:r>
+            <w:r>
+              <w:rPr>
+                <w:rStyle w:val="VerbatimChar"/>
+              </w:rPr>
+              <w:t xml:space="preserve">83:AB577</w:t>
+            </w:r>
+          </w:p>
+        </w:tc>
+      </w:tr>
+      <w:tr>
+        <w:tc>
+          <w:tcPr/>
+          <w:p>
+            <w:pPr>
+              <w:pStyle w:val="Compact"/>
+              <w:jc w:val="left"/>
+            </w:pPr>
+            <w:r>
+              <w:t xml:space="preserve">Citizen proposals and quoted phrases</w:t>
+            </w:r>
+          </w:p>
+        </w:tc>
+        <w:tc>
+          <w:tcPr/>
+          <w:p>
+            <w:pPr>
+              <w:pStyle w:val="Compact"/>
+              <w:jc w:val="left"/>
+            </w:pPr>
+            <w:r>
+              <w:t xml:space="preserve">“</w:t>
+            </w:r>
+            <w:r>
+              <w:t xml:space="preserve">NV1 - RAG - Phase 2 Constituent Input</w:t>
+            </w:r>
+            <w:r>
+              <w:t xml:space="preserve">”</w:t>
+            </w:r>
+            <w:r>
+              <w:t xml:space="preserve"> </w:t>
+            </w:r>
+            <w:r>
+              <w:t xml:space="preserve">(Water sheet), mirrored in</w:t>
+            </w:r>
+            <w:r>
+              <w:t xml:space="preserve"> </w:t>
+            </w:r>
+            <w:r>
+              <w:rPr>
+                <w:rStyle w:val="VerbatimChar"/>
+              </w:rPr>
+              <w:t xml:space="preserve">config/issues/nevada-water-scarcity.yaml → constituent_proposals</w:t>
+            </w:r>
+          </w:p>
+        </w:tc>
+      </w:tr>
+    </w:tbl>
+    <w:bookmarkEnd w:id="57"/>
+    <w:bookmarkStart w:id="58" w:name="review-status"/>
+    <w:p>
+      <w:pPr>
+        <w:pStyle w:val="Heading2"/>
+      </w:pPr>
+      <w:r>
+        <w:t xml:space="preserve">Review status</w:t>
+      </w:r>
+    </w:p>
+    <w:p>
+      <w:pPr>
+        <w:pStyle w:val="FirstParagraph"/>
+      </w:pPr>
+      <w:r>
+        <w:t xml:space="preserve">See</w:t>
+      </w:r>
+      <w:r>
+        <w:t xml:space="preserve"> </w:t>
+      </w:r>
+      <w:r>
+        <w:rPr>
+          <w:rStyle w:val="VerbatimChar"/>
+        </w:rPr>
+        <w:t xml:space="preserve">review-report.md</w:t>
+      </w:r>
+      <w:r>
+        <w:t xml:space="preserve"> </w:t>
+      </w:r>
+      <w:r>
+        <w:t xml:space="preserve">/</w:t>
+      </w:r>
+      <w:r>
+        <w:t xml:space="preserve"> </w:t>
+      </w:r>
+      <w:r>
+        <w:rPr>
+          <w:rStyle w:val="VerbatimChar"/>
+        </w:rPr>
+        <w:t xml:space="preserve">review-report.json</w:t>
+      </w:r>
+      <w:r>
+        <w:t xml:space="preserve"> </w:t>
+      </w:r>
+      <w:r>
+        <w:t xml:space="preserve">in the packet folder for the</w:t>
+      </w:r>
+      <w:r>
+        <w:t xml:space="preserve"> </w:t>
+      </w:r>
+      <w:r>
+        <w:t xml:space="preserve">automated checklist (no-advice scan, fact spot-checks, page-count renders)</w:t>
+      </w:r>
+      <w:r>
+        <w:t xml:space="preserve"> </w:t>
+      </w:r>
+      <w:r>
+        <w:t xml:space="preserve">and the items flagged for human judgment.</w:t>
+      </w:r>
+    </w:p>
+    <w:bookmarkEnd w:id="58"/>
+    <w:bookmarkEnd w:id="59"/>
     <w:sectPr/>
   </w:body>
 </w:document>
@@ -62567,15 +63818,16 @@
   <w:docDefaults>
     <w:rPrDefault>
       <w:rPr>
-        <w:rFonts w:asciiTheme="minorHAnsi" w:cstheme="minorBidi" w:eastAsiaTheme="minorHAnsi" w:hAnsiTheme="minorHAnsi"/>
-        <w:sz w:val="24"/>
-        <w:szCs w:val="24"/>
+        <w:rFonts w:ascii="Arial" w:cs="Arial" w:eastAsia="Arial" w:hAnsi="Arial"/>
+        <w:color w:val="444444"/>
+        <w:sz w:val="18"/>
+        <w:szCs w:val="18"/>
         <w:lang w:bidi="ar-SA" w:eastAsia="Arial" w:val="en-US"/>
       </w:rPr>
     </w:rPrDefault>
     <w:pPrDefault>
       <w:pPr>
-        <w:spacing w:after="200"/>
+        <w:spacing w:after="80" w:line="252" w:lineRule="auto"/>
       </w:pPr>
     </w:pPrDefault>
   </w:docDefaults>
@@ -62589,7 +63841,7 @@
     <w:basedOn w:val="Normal"/>
     <w:link w:val="BodyTextChar"/>
     <w:pPr>
-      <w:spacing w:after="180" w:before="180"/>
+      <w:spacing w:after="80" w:before="0" w:line="252" w:lineRule="auto"/>
     </w:pPr>
     <w:qFormat/>
   </w:style>
@@ -62604,7 +63856,7 @@
     <w:basedOn w:val="BodyText"/>
     <w:qFormat/>
     <w:pPr>
-      <w:spacing w:after="36" w:before="36"/>
+      <w:spacing w:after="40" w:before="0"/>
     </w:pPr>
   </w:style>
   <w:style w:styleId="Title" w:type="paragraph">
@@ -62615,16 +63867,16 @@
     <w:pPr>
       <w:keepNext/>
       <w:keepLines/>
-      <w:spacing w:after="240" w:before="480"/>
+      <w:spacing w:after="60" w:before="0"/>
       <w:jc w:val="center"/>
     </w:pPr>
     <w:rPr>
-      <w:rFonts w:asciiTheme="majorHAnsi" w:cstheme="majorBidi" w:eastAsiaTheme="majorEastAsia" w:hAnsiTheme="majorHAnsi"/>
+      <w:rFonts w:ascii="Arial" w:cs="Arial" w:eastAsia="Arial" w:hAnsi="Arial"/>
       <w:b/>
       <w:bCs/>
       <w:color w:themeColor="accent1" w:themeShade="B5" w:val="1A2D4F"/>
-      <w:sz w:val="36"/>
-      <w:szCs w:val="36"/>
+      <w:sz w:val="40"/>
+      <w:szCs w:val="40"/>
     </w:rPr>
   </w:style>
   <w:style w:styleId="Subtitle" w:type="paragraph">
@@ -62714,16 +63966,16 @@
     <w:pPr>
       <w:keepNext/>
       <w:keepLines/>
-      <w:spacing w:after="0" w:before="480"/>
+      <w:spacing w:after="40" w:before="0"/>
       <w:outlineLvl w:val="0"/>
     </w:pPr>
     <w:rPr>
-      <w:rFonts w:asciiTheme="majorHAnsi" w:cstheme="majorBidi" w:eastAsiaTheme="majorEastAsia" w:hAnsiTheme="majorHAnsi"/>
+      <w:rFonts w:ascii="Arial" w:cs="Arial" w:eastAsia="Arial" w:hAnsi="Arial"/>
       <w:b/>
       <w:bCs/>
       <w:color w:themeColor="accent1" w:val="1A2D4F"/>
-      <w:sz w:val="32"/>
-      <w:szCs w:val="32"/>
+      <w:sz w:val="36"/>
+      <w:szCs w:val="36"/>
     </w:rPr>
   </w:style>
   <w:style w:styleId="Heading2" w:type="paragraph">
@@ -62736,16 +63988,18 @@
     <w:pPr>
       <w:keepNext/>
       <w:keepLines/>
-      <w:spacing w:after="0" w:before="200"/>
+      <w:spacing w:after="40" w:before="140"/>
       <w:outlineLvl w:val="1"/>
     </w:pPr>
     <w:rPr>
-      <w:rFonts w:asciiTheme="majorHAnsi" w:cstheme="majorBidi" w:eastAsiaTheme="majorEastAsia" w:hAnsiTheme="majorHAnsi"/>
+      <w:rFonts w:ascii="Arial" w:cs="Arial" w:eastAsia="Arial" w:hAnsi="Arial"/>
       <w:b/>
       <w:bCs/>
       <w:color w:themeColor="accent1" w:val="C0392B"/>
-      <w:sz w:val="28"/>
-      <w:szCs w:val="28"/>
+      <w:sz w:val="22"/>
+      <w:szCs w:val="22"/>
+      <w:caps/>
+      <w:spacing w:val="20"/>
     </w:rPr>
   </w:style>
   <w:style w:styleId="Heading3" w:type="paragraph">
@@ -62758,16 +64012,16 @@
     <w:pPr>
       <w:keepNext/>
       <w:keepLines/>
-      <w:spacing w:after="0" w:before="200"/>
+      <w:spacing w:after="30" w:before="100"/>
       <w:outlineLvl w:val="2"/>
     </w:pPr>
     <w:rPr>
-      <w:rFonts w:asciiTheme="majorHAnsi" w:cstheme="majorBidi" w:eastAsiaTheme="majorEastAsia" w:hAnsiTheme="majorHAnsi"/>
+      <w:rFonts w:ascii="Arial" w:cs="Arial" w:eastAsia="Arial" w:hAnsi="Arial"/>
       <w:b/>
       <w:bCs/>
-      <w:color w:themeColor="accent1" w:val="1A2D4F"/>
-      <w:sz w:val="24"/>
-      <w:szCs w:val="24"/>
+      <w:color w:themeColor="accent1" w:val="2E4A78"/>
+      <w:sz w:val="20"/>
+      <w:szCs w:val="20"/>
     </w:rPr>
   </w:style>
   <w:style w:styleId="Heading4" w:type="paragraph">
@@ -62784,12 +64038,12 @@
       <w:outlineLvl w:val="3"/>
     </w:pPr>
     <w:rPr>
-      <w:rFonts w:asciiTheme="majorHAnsi" w:cstheme="majorBidi" w:eastAsiaTheme="majorEastAsia" w:hAnsiTheme="majorHAnsi"/>
+      <w:rFonts w:ascii="Arial" w:cs="Arial" w:eastAsia="Arial" w:hAnsi="Arial"/>
       <w:i/>
       <w:bCs/>
-      <w:color w:themeColor="accent1" w:val="1A2D4F"/>
-      <w:sz w:val="24"/>
-      <w:szCs w:val="24"/>
+      <w:color w:themeColor="accent1" w:val="2E4A78"/>
+      <w:sz w:val="18"/>
+      <w:szCs w:val="18"/>
     </w:rPr>
   </w:style>
   <w:style w:styleId="Heading5" w:type="paragraph">
@@ -62806,7 +64060,7 @@
       <w:outlineLvl w:val="4"/>
     </w:pPr>
     <w:rPr>
-      <w:rFonts w:asciiTheme="majorHAnsi" w:cstheme="majorBidi" w:eastAsiaTheme="majorEastAsia" w:hAnsiTheme="majorHAnsi"/>
+      <w:rFonts w:ascii="Arial" w:cs="Arial" w:eastAsia="Arial" w:hAnsi="Arial"/>
       <w:iCs/>
       <w:color w:themeColor="accent1" w:val="4F81BD"/>
       <w:sz w:val="24"/>
@@ -62827,7 +64081,7 @@
       <w:outlineLvl w:val="5"/>
     </w:pPr>
     <w:rPr>
-      <w:rFonts w:asciiTheme="majorHAnsi" w:cstheme="majorBidi" w:eastAsiaTheme="majorEastAsia" w:hAnsiTheme="majorHAnsi"/>
+      <w:rFonts w:ascii="Arial" w:cs="Arial" w:eastAsia="Arial" w:hAnsi="Arial"/>
       <w:color w:themeColor="accent1" w:val="4F81BD"/>
       <w:sz w:val="24"/>
       <w:szCs w:val="24"/>
@@ -62847,7 +64101,7 @@
       <w:outlineLvl w:val="6"/>
     </w:pPr>
     <w:rPr>
-      <w:rFonts w:asciiTheme="majorHAnsi" w:cstheme="majorBidi" w:eastAsiaTheme="majorEastAsia" w:hAnsiTheme="majorHAnsi"/>
+      <w:rFonts w:ascii="Arial" w:cs="Arial" w:eastAsia="Arial" w:hAnsi="Arial"/>
       <w:color w:themeColor="accent1" w:val="4F81BD"/>
       <w:sz w:val="24"/>
       <w:szCs w:val="24"/>
@@ -62867,7 +64121,7 @@
       <w:outlineLvl w:val="7"/>
     </w:pPr>
     <w:rPr>
-      <w:rFonts w:asciiTheme="majorHAnsi" w:cstheme="majorBidi" w:eastAsiaTheme="majorEastAsia" w:hAnsiTheme="majorHAnsi"/>
+      <w:rFonts w:ascii="Arial" w:cs="Arial" w:eastAsia="Arial" w:hAnsi="Arial"/>
       <w:color w:themeColor="accent1" w:val="4F81BD"/>
       <w:sz w:val="24"/>
       <w:szCs w:val="24"/>
@@ -62887,7 +64141,7 @@
       <w:outlineLvl w:val="8"/>
     </w:pPr>
     <w:rPr>
-      <w:rFonts w:asciiTheme="majorHAnsi" w:cstheme="majorBidi" w:eastAsiaTheme="majorEastAsia" w:hAnsiTheme="majorHAnsi"/>
+      <w:rFonts w:ascii="Arial" w:cs="Arial" w:eastAsia="Arial" w:hAnsi="Arial"/>
       <w:color w:themeColor="accent1" w:val="4F81BD"/>
       <w:sz w:val="24"/>
       <w:szCs w:val="24"/>
@@ -63008,7 +64262,7 @@
     <w:name w:val="Verbatim Char"/>
     <w:basedOn w:val="BodyTextChar"/>
     <w:rPr>
-      <w:rFonts w:ascii="Arial" w:hAnsi="Arial"/>
+      <w:rFonts w:ascii="Arial" w:cs="Arial" w:eastAsia="Arial" w:hAnsi="Arial"/>
       <w:sz w:val="22"/>
     </w:rPr>
   </w:style>
@@ -63042,7 +64296,7 @@
       <w:outlineLvl w:val="9"/>
     </w:pPr>
     <w:rPr>
-      <w:rFonts w:asciiTheme="majorHAnsi" w:cstheme="majorBidi" w:eastAsiaTheme="majorEastAsia" w:hAnsiTheme="majorHAnsi"/>
+      <w:rFonts w:ascii="Arial" w:cs="Arial" w:eastAsia="Arial" w:hAnsi="Arial"/>
       <w:b w:val="0"/>
       <w:bCs w:val="0"/>
       <w:color w:themeColor="accent1" w:themeShade="BF" w:val="365F91"/>

</xml_diff>